<commit_message>
SNS Notification Subscription feature removed
</commit_message>
<xml_diff>
--- a/docs/technical-design-document.docx
+++ b/docs/technical-design-document.docx
@@ -4431,344 +4431,2345 @@
     <w:p>
       <w:pPr/>
       <w:r>
-        <w:t>Key values:</w:t>
-      </w:r>
-    </w:p>
-    <w:p>
-      <w:pPr>
-        <w:pStyle w:val="ListBullet"/>
-      </w:pPr>
+        <w:t xml:space="preserve">Frontend settings are provided as container env vars and written at startup into </w:t>
+      </w:r>
       <w:r>
         <w:rPr>
           <w:rFonts w:ascii="Consolas" w:hAnsi="Consolas"/>
           <w:sz w:val="18"/>
         </w:rPr>
-        <w:t>BACKEND_UPSTREAM</w:t>
-      </w:r>
-      <w:r>
-        <w:t xml:space="preserve"> (example: </w:t>
+        <w:t>app-config.js</w:t>
+      </w:r>
+      <w:r>
+        <w:t xml:space="preserve"> (see </w:t>
       </w:r>
       <w:r>
         <w:rPr>
           <w:rFonts w:ascii="Consolas" w:hAnsi="Consolas"/>
           <w:sz w:val="18"/>
         </w:rPr>
-        <w:t>http://backend.screening.internal:8000</w:t>
-      </w:r>
-      <w:r>
-        <w:t>)</w:t>
+        <w:t>frontend/entrypoint.sh</w:t>
+      </w:r>
+      <w:r>
+        <w:t>).</w:t>
+      </w:r>
+    </w:p>
+    <w:tbl>
+      <w:tblPr>
+        <w:tblStyle w:val="TableGrid"/>
+        <w:tblW w:type="auto" w:w="0"/>
+        <w:tblLook w:firstColumn="1" w:firstRow="1" w:lastColumn="0" w:lastRow="0" w:noHBand="0" w:noVBand="1" w:val="04A0"/>
+      </w:tblPr>
+      <w:tblGrid>
+        <w:gridCol w:w="2880"/>
+        <w:gridCol w:w="2880"/>
+        <w:gridCol w:w="2880"/>
+      </w:tblGrid>
+      <w:tr>
+        <w:tc>
+          <w:tcPr>
+            <w:tcW w:type="dxa" w:w="2880"/>
+          </w:tcPr>
+          <w:p>
+            <w:r>
+              <w:rPr>
+                <w:b/>
+              </w:rPr>
+              <w:t>Parameter</w:t>
+            </w:r>
+          </w:p>
+        </w:tc>
+        <w:tc>
+          <w:tcPr>
+            <w:tcW w:type="dxa" w:w="2880"/>
+          </w:tcPr>
+          <w:p>
+            <w:r>
+              <w:rPr>
+                <w:b/>
+              </w:rPr>
+              <w:t>Default Value</w:t>
+            </w:r>
+          </w:p>
+        </w:tc>
+        <w:tc>
+          <w:tcPr>
+            <w:tcW w:type="dxa" w:w="2880"/>
+          </w:tcPr>
+          <w:p>
+            <w:r>
+              <w:rPr>
+                <w:b/>
+              </w:rPr>
+              <w:t>Explanation</w:t>
+            </w:r>
+          </w:p>
+        </w:tc>
+      </w:tr>
+      <w:tr>
+        <w:tc>
+          <w:tcPr>
+            <w:tcW w:type="dxa" w:w="2880"/>
+          </w:tcPr>
+          <w:p>
+            <w:r>
+              <w:t>`BACKEND_UPSTREAM`</w:t>
+            </w:r>
+          </w:p>
+        </w:tc>
+        <w:tc>
+          <w:tcPr>
+            <w:tcW w:type="dxa" w:w="2880"/>
+          </w:tcPr>
+          <w:p>
+            <w:r>
+              <w:t>`http://backend.screening.internal:8000`</w:t>
+            </w:r>
+          </w:p>
+        </w:tc>
+        <w:tc>
+          <w:tcPr>
+            <w:tcW w:type="dxa" w:w="2880"/>
+          </w:tcPr>
+          <w:p>
+            <w:r>
+              <w:t>Backend origin that Nginx proxies to for `/api/*` (typically the ECS service-discovery name).</w:t>
+            </w:r>
+          </w:p>
+        </w:tc>
+      </w:tr>
+      <w:tr>
+        <w:tc>
+          <w:tcPr>
+            <w:tcW w:type="dxa" w:w="2880"/>
+          </w:tcPr>
+          <w:p>
+            <w:r>
+              <w:t>`NGINX_CLIENT_MAX_BODY_SIZE`</w:t>
+            </w:r>
+          </w:p>
+        </w:tc>
+        <w:tc>
+          <w:tcPr>
+            <w:tcW w:type="dxa" w:w="2880"/>
+          </w:tcPr>
+          <w:p>
+            <w:r>
+              <w:t>`25m`</w:t>
+            </w:r>
+          </w:p>
+        </w:tc>
+        <w:tc>
+          <w:tcPr>
+            <w:tcW w:type="dxa" w:w="2880"/>
+          </w:tcPr>
+          <w:p>
+            <w:r>
+              <w:t>Max upload size for `/api/` reverse-proxy requests (must accommodate batch XLSX + `queries_json`).</w:t>
+            </w:r>
+          </w:p>
+        </w:tc>
+      </w:tr>
+      <w:tr>
+        <w:tc>
+          <w:tcPr>
+            <w:tcW w:type="dxa" w:w="2880"/>
+          </w:tcPr>
+          <w:p>
+            <w:r>
+              <w:t>`VITE_SCREENING_API_BASE_URL`</w:t>
+            </w:r>
+          </w:p>
+        </w:tc>
+        <w:tc>
+          <w:tcPr>
+            <w:tcW w:type="dxa" w:w="2880"/>
+          </w:tcPr>
+          <w:p>
+            <w:r>
+              <w:t>`/api/v1`</w:t>
+            </w:r>
+          </w:p>
+        </w:tc>
+        <w:tc>
+          <w:tcPr>
+            <w:tcW w:type="dxa" w:w="2880"/>
+          </w:tcPr>
+          <w:p>
+            <w:r>
+              <w:t>Base path used by the SPA for API requests (Nginx proxies `/api/*` to backend).</w:t>
+            </w:r>
+          </w:p>
+        </w:tc>
+      </w:tr>
+      <w:tr>
+        <w:tc>
+          <w:tcPr>
+            <w:tcW w:type="dxa" w:w="2880"/>
+          </w:tcPr>
+          <w:p>
+            <w:r>
+              <w:t>`VITE_SCREENING_POLL_INTERVAL_MS`</w:t>
+            </w:r>
+          </w:p>
+        </w:tc>
+        <w:tc>
+          <w:tcPr>
+            <w:tcW w:type="dxa" w:w="2880"/>
+          </w:tcPr>
+          <w:p>
+            <w:r>
+              <w:t>`750`</w:t>
+            </w:r>
+          </w:p>
+        </w:tc>
+        <w:tc>
+          <w:tcPr>
+            <w:tcW w:type="dxa" w:w="2880"/>
+          </w:tcPr>
+          <w:p>
+            <w:r>
+              <w:t>UI polling interval for job progress (`GET /api/v1/screenings/jobs/{job_id}`).</w:t>
+            </w:r>
+          </w:p>
+        </w:tc>
+      </w:tr>
+      <w:tr>
+        <w:tc>
+          <w:tcPr>
+            <w:tcW w:type="dxa" w:w="2880"/>
+          </w:tcPr>
+          <w:p>
+            <w:r>
+              <w:t>`VITE_SCREENING_JOB_TIMEOUT_MS`</w:t>
+            </w:r>
+          </w:p>
+        </w:tc>
+        <w:tc>
+          <w:tcPr>
+            <w:tcW w:type="dxa" w:w="2880"/>
+          </w:tcPr>
+          <w:p>
+            <w:r>
+              <w:t>`90000`</w:t>
+            </w:r>
+          </w:p>
+        </w:tc>
+        <w:tc>
+          <w:tcPr>
+            <w:tcW w:type="dxa" w:w="2880"/>
+          </w:tcPr>
+          <w:p>
+            <w:r>
+              <w:t>UI timeout for long-running job polling flows before surfacing a timeout to the user.</w:t>
+            </w:r>
+          </w:p>
+        </w:tc>
+      </w:tr>
+      <w:tr>
+        <w:tc>
+          <w:tcPr>
+            <w:tcW w:type="dxa" w:w="2880"/>
+          </w:tcPr>
+          <w:p>
+            <w:r>
+              <w:t>`VITE_AUTH_ENABLED`</w:t>
+            </w:r>
+          </w:p>
+        </w:tc>
+        <w:tc>
+          <w:tcPr>
+            <w:tcW w:type="dxa" w:w="2880"/>
+          </w:tcPr>
+          <w:p>
+            <w:r>
+              <w:t>`false`</w:t>
+            </w:r>
+          </w:p>
+        </w:tc>
+        <w:tc>
+          <w:tcPr>
+            <w:tcW w:type="dxa" w:w="2880"/>
+          </w:tcPr>
+          <w:p>
+            <w:r>
+              <w:t>Enables OIDC login + bearer token attachment to API calls.</w:t>
+            </w:r>
+          </w:p>
+        </w:tc>
+      </w:tr>
+      <w:tr>
+        <w:tc>
+          <w:tcPr>
+            <w:tcW w:type="dxa" w:w="2880"/>
+          </w:tcPr>
+          <w:p>
+            <w:r>
+              <w:t>`VITE_OIDC_AUTHORITY`</w:t>
+            </w:r>
+          </w:p>
+        </w:tc>
+        <w:tc>
+          <w:tcPr>
+            <w:tcW w:type="dxa" w:w="2880"/>
+          </w:tcPr>
+          <w:p>
+            <w:r>
+              <w:t>*(empty)*</w:t>
+            </w:r>
+          </w:p>
+        </w:tc>
+        <w:tc>
+          <w:tcPr>
+            <w:tcW w:type="dxa" w:w="2880"/>
+          </w:tcPr>
+          <w:p>
+            <w:r>
+              <w:t>OIDC issuer/authority URL (required when `VITE_AUTH_ENABLED=true`).</w:t>
+            </w:r>
+          </w:p>
+        </w:tc>
+      </w:tr>
+      <w:tr>
+        <w:tc>
+          <w:tcPr>
+            <w:tcW w:type="dxa" w:w="2880"/>
+          </w:tcPr>
+          <w:p>
+            <w:r>
+              <w:t>`VITE_OIDC_CLIENT_ID`</w:t>
+            </w:r>
+          </w:p>
+        </w:tc>
+        <w:tc>
+          <w:tcPr>
+            <w:tcW w:type="dxa" w:w="2880"/>
+          </w:tcPr>
+          <w:p>
+            <w:r>
+              <w:t>*(empty)*</w:t>
+            </w:r>
+          </w:p>
+        </w:tc>
+        <w:tc>
+          <w:tcPr>
+            <w:tcW w:type="dxa" w:w="2880"/>
+          </w:tcPr>
+          <w:p>
+            <w:r>
+              <w:t>OIDC client id (required when `VITE_AUTH_ENABLED=true`).</w:t>
+            </w:r>
+          </w:p>
+        </w:tc>
+      </w:tr>
+      <w:tr>
+        <w:tc>
+          <w:tcPr>
+            <w:tcW w:type="dxa" w:w="2880"/>
+          </w:tcPr>
+          <w:p>
+            <w:r>
+              <w:t>`VITE_OIDC_REDIRECT_URI`</w:t>
+            </w:r>
+          </w:p>
+        </w:tc>
+        <w:tc>
+          <w:tcPr>
+            <w:tcW w:type="dxa" w:w="2880"/>
+          </w:tcPr>
+          <w:p>
+            <w:r>
+              <w:t>*(empty)*</w:t>
+            </w:r>
+          </w:p>
+        </w:tc>
+        <w:tc>
+          <w:tcPr>
+            <w:tcW w:type="dxa" w:w="2880"/>
+          </w:tcPr>
+          <w:p>
+            <w:r>
+              <w:t>OIDC redirect URI. If blank, frontend code falls back to `${window.location.origin}/`.</w:t>
+            </w:r>
+          </w:p>
+        </w:tc>
+      </w:tr>
+      <w:tr>
+        <w:tc>
+          <w:tcPr>
+            <w:tcW w:type="dxa" w:w="2880"/>
+          </w:tcPr>
+          <w:p>
+            <w:r>
+              <w:t>`VITE_OIDC_POST_LOGOUT_REDIRECT_URI`</w:t>
+            </w:r>
+          </w:p>
+        </w:tc>
+        <w:tc>
+          <w:tcPr>
+            <w:tcW w:type="dxa" w:w="2880"/>
+          </w:tcPr>
+          <w:p>
+            <w:r>
+              <w:t>*(empty)*</w:t>
+            </w:r>
+          </w:p>
+        </w:tc>
+        <w:tc>
+          <w:tcPr>
+            <w:tcW w:type="dxa" w:w="2880"/>
+          </w:tcPr>
+          <w:p>
+            <w:r>
+              <w:t>Optional post-logout redirect. If blank, frontend falls back to the redirect URI.</w:t>
+            </w:r>
+          </w:p>
+        </w:tc>
+      </w:tr>
+      <w:tr>
+        <w:tc>
+          <w:tcPr>
+            <w:tcW w:type="dxa" w:w="2880"/>
+          </w:tcPr>
+          <w:p>
+            <w:r>
+              <w:t>`VITE_OIDC_SCOPE`</w:t>
+            </w:r>
+          </w:p>
+        </w:tc>
+        <w:tc>
+          <w:tcPr>
+            <w:tcW w:type="dxa" w:w="2880"/>
+          </w:tcPr>
+          <w:p>
+            <w:r>
+              <w:t>`openid profile email`</w:t>
+            </w:r>
+          </w:p>
+        </w:tc>
+        <w:tc>
+          <w:tcPr>
+            <w:tcW w:type="dxa" w:w="2880"/>
+          </w:tcPr>
+          <w:p>
+            <w:r>
+              <w:t>Requested scopes (add `roles` / group scope if your IdP requires it).</w:t>
+            </w:r>
+          </w:p>
+        </w:tc>
+      </w:tr>
+      <w:tr>
+        <w:tc>
+          <w:tcPr>
+            <w:tcW w:type="dxa" w:w="2880"/>
+          </w:tcPr>
+          <w:p>
+            <w:r>
+              <w:t>`VITE_OIDC_IDLE_TIMEOUT_MS`</w:t>
+            </w:r>
+          </w:p>
+        </w:tc>
+        <w:tc>
+          <w:tcPr>
+            <w:tcW w:type="dxa" w:w="2880"/>
+          </w:tcPr>
+          <w:p>
+            <w:r>
+              <w:t>`900000`</w:t>
+            </w:r>
+          </w:p>
+        </w:tc>
+        <w:tc>
+          <w:tcPr>
+            <w:tcW w:type="dxa" w:w="2880"/>
+          </w:tcPr>
+          <w:p>
+            <w:r>
+              <w:t>Frontend session idle timeout (ms).</w:t>
+            </w:r>
+          </w:p>
+        </w:tc>
+      </w:tr>
+      <w:tr>
+        <w:tc>
+          <w:tcPr>
+            <w:tcW w:type="dxa" w:w="2880"/>
+          </w:tcPr>
+          <w:p>
+            <w:r>
+              <w:t>`VITE_OIDC_CLEAR_SESSION_ON_CLOSE`</w:t>
+            </w:r>
+          </w:p>
+        </w:tc>
+        <w:tc>
+          <w:tcPr>
+            <w:tcW w:type="dxa" w:w="2880"/>
+          </w:tcPr>
+          <w:p>
+            <w:r>
+              <w:t>`true`</w:t>
+            </w:r>
+          </w:p>
+        </w:tc>
+        <w:tc>
+          <w:tcPr>
+            <w:tcW w:type="dxa" w:w="2880"/>
+          </w:tcPr>
+          <w:p>
+            <w:r>
+              <w:t>If `true`, clears stored auth/session state when the browser tab is closed.</w:t>
+            </w:r>
+          </w:p>
+        </w:tc>
+      </w:tr>
+    </w:tbl>
+    <w:p>
+      <w:pPr>
+        <w:pStyle w:val="Heading3"/>
+      </w:pPr>
+      <w:r>
+        <w:t>10.2 Backend/Worker (container env)</w:t>
       </w:r>
     </w:p>
     <w:p>
-      <w:pPr>
-        <w:pStyle w:val="ListBullet"/>
-      </w:pPr>
+      <w:pPr/>
+      <w:r>
+        <w:t xml:space="preserve">Backend and worker share the same settings (see </w:t>
+      </w:r>
       <w:r>
         <w:rPr>
           <w:rFonts w:ascii="Consolas" w:hAnsi="Consolas"/>
           <w:sz w:val="18"/>
         </w:rPr>
-        <w:t>VITE_SCREENING_API_BASE_URL</w:t>
-      </w:r>
-      <w:r>
-        <w:t xml:space="preserve"> (default: </w:t>
+        <w:t>backend/app/config.py</w:t>
+      </w:r>
+      <w:r>
+        <w:t xml:space="preserve"> and </w:t>
       </w:r>
       <w:r>
         <w:rPr>
           <w:rFonts w:ascii="Consolas" w:hAnsi="Consolas"/>
           <w:sz w:val="18"/>
         </w:rPr>
-        <w:t>/api/v1</w:t>
-      </w:r>
-      <w:r>
-        <w:t>)</w:t>
+        <w:t>backend/.env.example</w:t>
+      </w:r>
+      <w:r>
+        <w:t>).</w:t>
       </w:r>
     </w:p>
-    <w:p>
-      <w:pPr>
-        <w:pStyle w:val="ListBullet"/>
-      </w:pPr>
-      <w:r>
-        <w:rPr>
-          <w:rFonts w:ascii="Consolas" w:hAnsi="Consolas"/>
-          <w:sz w:val="18"/>
-        </w:rPr>
-        <w:t>VITE_AUTH_ENABLED</w:t>
-      </w:r>
-      <w:r>
-        <w:t xml:space="preserve"> / OIDC settings</w:t>
-      </w:r>
-    </w:p>
-    <w:p>
-      <w:pPr>
-        <w:pStyle w:val="Heading3"/>
-      </w:pPr>
-      <w:r>
-        <w:t>10.2 Backend/Worker (container env)</w:t>
-      </w:r>
-    </w:p>
-    <w:p>
-      <w:pPr/>
-      <w:r>
-        <w:t>Key values:</w:t>
-      </w:r>
-    </w:p>
-    <w:p>
-      <w:pPr>
-        <w:pStyle w:val="ListBullet"/>
-      </w:pPr>
-      <w:r>
-        <w:rPr>
-          <w:rFonts w:ascii="Consolas" w:hAnsi="Consolas"/>
-          <w:sz w:val="18"/>
-        </w:rPr>
-        <w:t>APP_DB_URL</w:t>
-      </w:r>
-      <w:r>
-        <w:t xml:space="preserve"> (PostgreSQL connection string)</w:t>
-      </w:r>
-    </w:p>
-    <w:p>
-      <w:pPr>
-        <w:pStyle w:val="ListBullet"/>
-      </w:pPr>
-      <w:r>
-        <w:rPr>
-          <w:rFonts w:ascii="Consolas" w:hAnsi="Consolas"/>
-          <w:sz w:val="18"/>
-        </w:rPr>
-        <w:t>AWS_SQS_QUEUE_NAME</w:t>
-      </w:r>
-    </w:p>
-    <w:p>
-      <w:pPr>
-        <w:pStyle w:val="ListBullet"/>
-      </w:pPr>
-      <w:r>
-        <w:rPr>
-          <w:rFonts w:ascii="Consolas" w:hAnsi="Consolas"/>
-          <w:sz w:val="18"/>
-        </w:rPr>
-        <w:t>AUTH_ENABLED</w:t>
-      </w:r>
-      <w:r>
-        <w:t xml:space="preserve">, </w:t>
-      </w:r>
-      <w:r>
-        <w:rPr>
-          <w:rFonts w:ascii="Consolas" w:hAnsi="Consolas"/>
-          <w:sz w:val="18"/>
-        </w:rPr>
-        <w:t>AUTH_ISSUER</w:t>
-      </w:r>
-      <w:r>
-        <w:t xml:space="preserve">, </w:t>
-      </w:r>
-      <w:r>
-        <w:rPr>
-          <w:rFonts w:ascii="Consolas" w:hAnsi="Consolas"/>
-          <w:sz w:val="18"/>
-        </w:rPr>
-        <w:t>AUTH_JWKS_URL</w:t>
-      </w:r>
-      <w:r>
-        <w:t xml:space="preserve">, </w:t>
-      </w:r>
-      <w:r>
-        <w:rPr>
-          <w:rFonts w:ascii="Consolas" w:hAnsi="Consolas"/>
-          <w:sz w:val="18"/>
-        </w:rPr>
-        <w:t>AUTH_AUDIENCE</w:t>
-      </w:r>
-    </w:p>
-    <w:p>
-      <w:pPr>
-        <w:pStyle w:val="ListBullet"/>
-      </w:pPr>
-      <w:r>
-        <w:rPr>
-          <w:rFonts w:ascii="Consolas" w:hAnsi="Consolas"/>
-          <w:sz w:val="18"/>
-        </w:rPr>
-        <w:t>SCREENING_TPS</w:t>
-      </w:r>
-    </w:p>
-    <w:p>
-      <w:pPr>
-        <w:pStyle w:val="ListBullet"/>
-      </w:pPr>
-      <w:r>
-        <w:rPr>
-          <w:rFonts w:ascii="Consolas" w:hAnsi="Consolas"/>
-          <w:sz w:val="18"/>
-        </w:rPr>
-        <w:t>AUDIT_ACCESS_LOG_ENABLED</w:t>
-      </w:r>
-      <w:r>
-        <w:t xml:space="preserve"> (default </w:t>
-      </w:r>
-      <w:r>
-        <w:rPr>
-          <w:rFonts w:ascii="Consolas" w:hAnsi="Consolas"/>
-          <w:sz w:val="18"/>
-        </w:rPr>
-        <w:t>true</w:t>
-      </w:r>
-      <w:r>
-        <w:t>)</w:t>
-      </w:r>
-    </w:p>
-    <w:p>
-      <w:pPr>
-        <w:pStyle w:val="ListBullet"/>
-      </w:pPr>
-      <w:r>
-        <w:rPr>
-          <w:rFonts w:ascii="Consolas" w:hAnsi="Consolas"/>
-          <w:sz w:val="18"/>
-        </w:rPr>
-        <w:t>AUDIT_EVENT_RETENTION_DAYS</w:t>
-      </w:r>
-      <w:r>
-        <w:t xml:space="preserve"> (default </w:t>
-      </w:r>
-      <w:r>
-        <w:rPr>
-          <w:rFonts w:ascii="Consolas" w:hAnsi="Consolas"/>
-          <w:sz w:val="18"/>
-        </w:rPr>
-        <w:t>3650</w:t>
-      </w:r>
-      <w:r>
-        <w:t>)</w:t>
-      </w:r>
-    </w:p>
-    <w:p>
-      <w:pPr>
-        <w:pStyle w:val="ListBullet"/>
-      </w:pPr>
-      <w:r>
-        <w:rPr>
-          <w:rFonts w:ascii="Consolas" w:hAnsi="Consolas"/>
-          <w:sz w:val="18"/>
-        </w:rPr>
-        <w:t>API_ACCESS_LOG_RETENTION_DAYS</w:t>
-      </w:r>
-      <w:r>
-        <w:t xml:space="preserve"> (default </w:t>
-      </w:r>
-      <w:r>
-        <w:rPr>
-          <w:rFonts w:ascii="Consolas" w:hAnsi="Consolas"/>
-          <w:sz w:val="18"/>
-        </w:rPr>
-        <w:t>365</w:t>
-      </w:r>
-      <w:r>
-        <w:t>)</w:t>
-      </w:r>
-    </w:p>
-    <w:p>
-      <w:pPr>
-        <w:pStyle w:val="ListBullet"/>
-      </w:pPr>
-      <w:r>
-        <w:rPr>
-          <w:rFonts w:ascii="Consolas" w:hAnsi="Consolas"/>
-          <w:sz w:val="18"/>
-        </w:rPr>
-        <w:t>EXTERNAL_API_ERROR_RETENTION_DAYS</w:t>
-      </w:r>
-      <w:r>
-        <w:t xml:space="preserve"> (default </w:t>
-      </w:r>
-      <w:r>
-        <w:rPr>
-          <w:rFonts w:ascii="Consolas" w:hAnsi="Consolas"/>
-          <w:sz w:val="18"/>
-        </w:rPr>
-        <w:t>365</w:t>
-      </w:r>
-      <w:r>
-        <w:t>)</w:t>
-      </w:r>
-    </w:p>
-    <w:p>
-      <w:pPr>
-        <w:pStyle w:val="ListBullet"/>
-      </w:pPr>
-      <w:r>
-        <w:rPr>
-          <w:rFonts w:ascii="Consolas" w:hAnsi="Consolas"/>
-          <w:sz w:val="18"/>
-        </w:rPr>
-        <w:t>OPERATIONAL_CLEANUP_INTERVAL_S</w:t>
-      </w:r>
-      <w:r>
-        <w:t xml:space="preserve"> (default </w:t>
-      </w:r>
-      <w:r>
-        <w:rPr>
-          <w:rFonts w:ascii="Consolas" w:hAnsi="Consolas"/>
-          <w:sz w:val="18"/>
-        </w:rPr>
-        <w:t>3600</w:t>
-      </w:r>
-      <w:r>
-        <w:t>)</w:t>
-      </w:r>
-    </w:p>
-    <w:p>
-      <w:pPr>
-        <w:pStyle w:val="ListBullet"/>
-      </w:pPr>
-      <w:r>
-        <w:rPr>
-          <w:rFonts w:ascii="Consolas" w:hAnsi="Consolas"/>
-          <w:sz w:val="18"/>
-        </w:rPr>
-        <w:t>HIGH_RISK_EXTERNAL_API_ERROR_WINDOW_MINUTES</w:t>
-      </w:r>
-      <w:r>
-        <w:t xml:space="preserve"> (default </w:t>
-      </w:r>
-      <w:r>
-        <w:rPr>
-          <w:rFonts w:ascii="Consolas" w:hAnsi="Consolas"/>
-          <w:sz w:val="18"/>
-        </w:rPr>
-        <w:t>15</w:t>
-      </w:r>
-      <w:r>
-        <w:t>)</w:t>
-      </w:r>
-    </w:p>
-    <w:p>
-      <w:pPr>
-        <w:pStyle w:val="ListBullet"/>
-      </w:pPr>
-      <w:r>
-        <w:rPr>
-          <w:rFonts w:ascii="Consolas" w:hAnsi="Consolas"/>
-          <w:sz w:val="18"/>
-        </w:rPr>
-        <w:t>HIGH_RISK_EXTERNAL_API_ERROR_THRESHOLD</w:t>
-      </w:r>
-      <w:r>
-        <w:t xml:space="preserve"> (default </w:t>
-      </w:r>
-      <w:r>
-        <w:rPr>
-          <w:rFonts w:ascii="Consolas" w:hAnsi="Consolas"/>
-          <w:sz w:val="18"/>
-        </w:rPr>
-        <w:t>10</w:t>
-      </w:r>
-      <w:r>
-        <w:t>)</w:t>
-      </w:r>
-    </w:p>
+    <w:tbl>
+      <w:tblPr>
+        <w:tblStyle w:val="TableGrid"/>
+        <w:tblW w:type="auto" w:w="0"/>
+        <w:tblLook w:firstColumn="1" w:firstRow="1" w:lastColumn="0" w:lastRow="0" w:noHBand="0" w:noVBand="1" w:val="04A0"/>
+      </w:tblPr>
+      <w:tblGrid>
+        <w:gridCol w:w="2880"/>
+        <w:gridCol w:w="2880"/>
+        <w:gridCol w:w="2880"/>
+      </w:tblGrid>
+      <w:tr>
+        <w:tc>
+          <w:tcPr>
+            <w:tcW w:type="dxa" w:w="2880"/>
+          </w:tcPr>
+          <w:p>
+            <w:r>
+              <w:rPr>
+                <w:b/>
+              </w:rPr>
+              <w:t>Parameter</w:t>
+            </w:r>
+          </w:p>
+        </w:tc>
+        <w:tc>
+          <w:tcPr>
+            <w:tcW w:type="dxa" w:w="2880"/>
+          </w:tcPr>
+          <w:p>
+            <w:r>
+              <w:rPr>
+                <w:b/>
+              </w:rPr>
+              <w:t>Default Value</w:t>
+            </w:r>
+          </w:p>
+        </w:tc>
+        <w:tc>
+          <w:tcPr>
+            <w:tcW w:type="dxa" w:w="2880"/>
+          </w:tcPr>
+          <w:p>
+            <w:r>
+              <w:rPr>
+                <w:b/>
+              </w:rPr>
+              <w:t>Explanation</w:t>
+            </w:r>
+          </w:p>
+        </w:tc>
+      </w:tr>
+      <w:tr>
+        <w:tc>
+          <w:tcPr>
+            <w:tcW w:type="dxa" w:w="2880"/>
+          </w:tcPr>
+          <w:p>
+            <w:r>
+              <w:t>`APP_NAME`</w:t>
+            </w:r>
+          </w:p>
+        </w:tc>
+        <w:tc>
+          <w:tcPr>
+            <w:tcW w:type="dxa" w:w="2880"/>
+          </w:tcPr>
+          <w:p>
+            <w:r>
+              <w:t>`OFAC Screening Enterprise API`</w:t>
+            </w:r>
+          </w:p>
+        </w:tc>
+        <w:tc>
+          <w:tcPr>
+            <w:tcW w:type="dxa" w:w="2880"/>
+          </w:tcPr>
+          <w:p>
+            <w:r>
+              <w:t>Used by FastAPI for service metadata/log labeling.</w:t>
+            </w:r>
+          </w:p>
+        </w:tc>
+      </w:tr>
+      <w:tr>
+        <w:tc>
+          <w:tcPr>
+            <w:tcW w:type="dxa" w:w="2880"/>
+          </w:tcPr>
+          <w:p>
+            <w:r>
+              <w:t>`APP_VERSION`</w:t>
+            </w:r>
+          </w:p>
+        </w:tc>
+        <w:tc>
+          <w:tcPr>
+            <w:tcW w:type="dxa" w:w="2880"/>
+          </w:tcPr>
+          <w:p>
+            <w:r>
+              <w:t>`1.0.0`</w:t>
+            </w:r>
+          </w:p>
+        </w:tc>
+        <w:tc>
+          <w:tcPr>
+            <w:tcW w:type="dxa" w:w="2880"/>
+          </w:tcPr>
+          <w:p>
+            <w:r>
+              <w:t>Used by FastAPI for service metadata.</w:t>
+            </w:r>
+          </w:p>
+        </w:tc>
+      </w:tr>
+      <w:tr>
+        <w:tc>
+          <w:tcPr>
+            <w:tcW w:type="dxa" w:w="2880"/>
+          </w:tcPr>
+          <w:p>
+            <w:r>
+              <w:t>`APP_DB_PATH`</w:t>
+            </w:r>
+          </w:p>
+        </w:tc>
+        <w:tc>
+          <w:tcPr>
+            <w:tcW w:type="dxa" w:w="2880"/>
+          </w:tcPr>
+          <w:p>
+            <w:r>
+              <w:t>`/tmp/screening.db`</w:t>
+            </w:r>
+          </w:p>
+        </w:tc>
+        <w:tc>
+          <w:tcPr>
+            <w:tcW w:type="dxa" w:w="2880"/>
+          </w:tcPr>
+          <w:p>
+            <w:r>
+              <w:t>SQLite path (used when `APP_DB_URL` is not configured).</w:t>
+            </w:r>
+          </w:p>
+        </w:tc>
+      </w:tr>
+      <w:tr>
+        <w:tc>
+          <w:tcPr>
+            <w:tcW w:type="dxa" w:w="2880"/>
+          </w:tcPr>
+          <w:p>
+            <w:r>
+              <w:t>`APP_DB_URL`</w:t>
+            </w:r>
+          </w:p>
+        </w:tc>
+        <w:tc>
+          <w:tcPr>
+            <w:tcW w:type="dxa" w:w="2880"/>
+          </w:tcPr>
+          <w:p>
+            <w:r>
+              <w:t>*(empty)*</w:t>
+            </w:r>
+          </w:p>
+        </w:tc>
+        <w:tc>
+          <w:tcPr>
+            <w:tcW w:type="dxa" w:w="2880"/>
+          </w:tcPr>
+          <w:p>
+            <w:r>
+              <w:t>PostgreSQL connection string. Set in AWS deployments (recommended).</w:t>
+            </w:r>
+          </w:p>
+        </w:tc>
+      </w:tr>
+      <w:tr>
+        <w:tc>
+          <w:tcPr>
+            <w:tcW w:type="dxa" w:w="2880"/>
+          </w:tcPr>
+          <w:p>
+            <w:r>
+              <w:t>`CORS_ALLOW_ORIGINS`</w:t>
+            </w:r>
+          </w:p>
+        </w:tc>
+        <w:tc>
+          <w:tcPr>
+            <w:tcW w:type="dxa" w:w="2880"/>
+          </w:tcPr>
+          <w:p>
+            <w:r>
+              <w:t>`*`</w:t>
+            </w:r>
+          </w:p>
+        </w:tc>
+        <w:tc>
+          <w:tcPr>
+            <w:tcW w:type="dxa" w:w="2880"/>
+          </w:tcPr>
+          <w:p>
+            <w:r>
+              <w:t>CORS allow-list for API responses. Tighten in production.</w:t>
+            </w:r>
+          </w:p>
+        </w:tc>
+      </w:tr>
+      <w:tr>
+        <w:tc>
+          <w:tcPr>
+            <w:tcW w:type="dxa" w:w="2880"/>
+          </w:tcPr>
+          <w:p>
+            <w:r>
+              <w:t>`MULTIPART_MAX_PART_SIZE`</w:t>
+            </w:r>
+          </w:p>
+        </w:tc>
+        <w:tc>
+          <w:tcPr>
+            <w:tcW w:type="dxa" w:w="2880"/>
+          </w:tcPr>
+          <w:p>
+            <w:r>
+              <w:t>`25m`</w:t>
+            </w:r>
+          </w:p>
+        </w:tc>
+        <w:tc>
+          <w:tcPr>
+            <w:tcW w:type="dxa" w:w="2880"/>
+          </w:tcPr>
+          <w:p>
+            <w:r>
+              <w:t>Max multipart part size accepted by the backend for `/screenings/batch-upload`.</w:t>
+            </w:r>
+          </w:p>
+        </w:tc>
+      </w:tr>
+      <w:tr>
+        <w:tc>
+          <w:tcPr>
+            <w:tcW w:type="dxa" w:w="2880"/>
+          </w:tcPr>
+          <w:p>
+            <w:r>
+              <w:t>`AWS_REGION`</w:t>
+            </w:r>
+          </w:p>
+        </w:tc>
+        <w:tc>
+          <w:tcPr>
+            <w:tcW w:type="dxa" w:w="2880"/>
+          </w:tcPr>
+          <w:p>
+            <w:r>
+              <w:t>`us-east-1`</w:t>
+            </w:r>
+          </w:p>
+        </w:tc>
+        <w:tc>
+          <w:tcPr>
+            <w:tcW w:type="dxa" w:w="2880"/>
+          </w:tcPr>
+          <w:p>
+            <w:r>
+              <w:t>AWS region for SQS/S3/SNS clients.</w:t>
+            </w:r>
+          </w:p>
+        </w:tc>
+      </w:tr>
+      <w:tr>
+        <w:tc>
+          <w:tcPr>
+            <w:tcW w:type="dxa" w:w="2880"/>
+          </w:tcPr>
+          <w:p>
+            <w:r>
+              <w:t>`AWS_SQS_QUEUE_NAME`</w:t>
+            </w:r>
+          </w:p>
+        </w:tc>
+        <w:tc>
+          <w:tcPr>
+            <w:tcW w:type="dxa" w:w="2880"/>
+          </w:tcPr>
+          <w:p>
+            <w:r>
+              <w:t>`screening-requests`</w:t>
+            </w:r>
+          </w:p>
+        </w:tc>
+        <w:tc>
+          <w:tcPr>
+            <w:tcW w:type="dxa" w:w="2880"/>
+          </w:tcPr>
+          <w:p>
+            <w:r>
+              <w:t>Queue used for async screening.</w:t>
+            </w:r>
+          </w:p>
+        </w:tc>
+      </w:tr>
+      <w:tr>
+        <w:tc>
+          <w:tcPr>
+            <w:tcW w:type="dxa" w:w="2880"/>
+          </w:tcPr>
+          <w:p>
+            <w:r>
+              <w:t>`AWS_ENDPOINT_URL`</w:t>
+            </w:r>
+          </w:p>
+        </w:tc>
+        <w:tc>
+          <w:tcPr>
+            <w:tcW w:type="dxa" w:w="2880"/>
+          </w:tcPr>
+          <w:p>
+            <w:r>
+              <w:t>*(empty)*</w:t>
+            </w:r>
+          </w:p>
+        </w:tc>
+        <w:tc>
+          <w:tcPr>
+            <w:tcW w:type="dxa" w:w="2880"/>
+          </w:tcPr>
+          <w:p>
+            <w:r>
+              <w:t>Optional override for localstack/dev.</w:t>
+            </w:r>
+          </w:p>
+        </w:tc>
+      </w:tr>
+      <w:tr>
+        <w:tc>
+          <w:tcPr>
+            <w:tcW w:type="dxa" w:w="2880"/>
+          </w:tcPr>
+          <w:p>
+            <w:r>
+              <w:t>`AWS_ACCESS_KEY_ID`</w:t>
+            </w:r>
+          </w:p>
+        </w:tc>
+        <w:tc>
+          <w:tcPr>
+            <w:tcW w:type="dxa" w:w="2880"/>
+          </w:tcPr>
+          <w:p>
+            <w:r>
+              <w:t>*(empty)*</w:t>
+            </w:r>
+          </w:p>
+        </w:tc>
+        <w:tc>
+          <w:tcPr>
+            <w:tcW w:type="dxa" w:w="2880"/>
+          </w:tcPr>
+          <w:p>
+            <w:r>
+              <w:t>Optional static credentials (prefer ECS task role in AWS).</w:t>
+            </w:r>
+          </w:p>
+        </w:tc>
+      </w:tr>
+      <w:tr>
+        <w:tc>
+          <w:tcPr>
+            <w:tcW w:type="dxa" w:w="2880"/>
+          </w:tcPr>
+          <w:p>
+            <w:r>
+              <w:t>`AWS_SECRET_ACCESS_KEY`</w:t>
+            </w:r>
+          </w:p>
+        </w:tc>
+        <w:tc>
+          <w:tcPr>
+            <w:tcW w:type="dxa" w:w="2880"/>
+          </w:tcPr>
+          <w:p>
+            <w:r>
+              <w:t>*(empty)*</w:t>
+            </w:r>
+          </w:p>
+        </w:tc>
+        <w:tc>
+          <w:tcPr>
+            <w:tcW w:type="dxa" w:w="2880"/>
+          </w:tcPr>
+          <w:p>
+            <w:r>
+              <w:t>Optional static credentials (prefer ECS task role in AWS).</w:t>
+            </w:r>
+          </w:p>
+        </w:tc>
+      </w:tr>
+      <w:tr>
+        <w:tc>
+          <w:tcPr>
+            <w:tcW w:type="dxa" w:w="2880"/>
+          </w:tcPr>
+          <w:p>
+            <w:r>
+              <w:t>`AWS_S3_UPLOAD_BUCKET`</w:t>
+            </w:r>
+          </w:p>
+        </w:tc>
+        <w:tc>
+          <w:tcPr>
+            <w:tcW w:type="dxa" w:w="2880"/>
+          </w:tcPr>
+          <w:p>
+            <w:r>
+              <w:t>*(empty)*</w:t>
+            </w:r>
+          </w:p>
+        </w:tc>
+        <w:tc>
+          <w:tcPr>
+            <w:tcW w:type="dxa" w:w="2880"/>
+          </w:tcPr>
+          <w:p>
+            <w:r>
+              <w:t>Enables S3 storage for uploads. Required for large batch `JOB_DISPATCH` flow.</w:t>
+            </w:r>
+          </w:p>
+        </w:tc>
+      </w:tr>
+      <w:tr>
+        <w:tc>
+          <w:tcPr>
+            <w:tcW w:type="dxa" w:w="2880"/>
+          </w:tcPr>
+          <w:p>
+            <w:r>
+              <w:t>`AWS_S3_UPLOAD_PREFIX`</w:t>
+            </w:r>
+          </w:p>
+        </w:tc>
+        <w:tc>
+          <w:tcPr>
+            <w:tcW w:type="dxa" w:w="2880"/>
+          </w:tcPr>
+          <w:p>
+            <w:r>
+              <w:t>`screening-input`</w:t>
+            </w:r>
+          </w:p>
+        </w:tc>
+        <w:tc>
+          <w:tcPr>
+            <w:tcW w:type="dxa" w:w="2880"/>
+          </w:tcPr>
+          <w:p>
+            <w:r>
+              <w:t>Key prefix for S3 uploads (source files and `queries.json`).</w:t>
+            </w:r>
+          </w:p>
+        </w:tc>
+      </w:tr>
+      <w:tr>
+        <w:tc>
+          <w:tcPr>
+            <w:tcW w:type="dxa" w:w="2880"/>
+          </w:tcPr>
+          <w:p>
+            <w:r>
+              <w:t>`AWS_SNS_NOTIFICATIONS_ENABLED`</w:t>
+            </w:r>
+          </w:p>
+        </w:tc>
+        <w:tc>
+          <w:tcPr>
+            <w:tcW w:type="dxa" w:w="2880"/>
+          </w:tcPr>
+          <w:p>
+            <w:r>
+              <w:t>`false`</w:t>
+            </w:r>
+          </w:p>
+        </w:tc>
+        <w:tc>
+          <w:tcPr>
+            <w:tcW w:type="dxa" w:w="2880"/>
+          </w:tcPr>
+          <w:p>
+            <w:r>
+              <w:t>Enables SNS notifications for scheduled screening completion.</w:t>
+            </w:r>
+          </w:p>
+        </w:tc>
+      </w:tr>
+      <w:tr>
+        <w:tc>
+          <w:tcPr>
+            <w:tcW w:type="dxa" w:w="2880"/>
+          </w:tcPr>
+          <w:p>
+            <w:r>
+              <w:t>`AWS_SNS_SCHEDULE_TOPIC_PREFIX`</w:t>
+            </w:r>
+          </w:p>
+        </w:tc>
+        <w:tc>
+          <w:tcPr>
+            <w:tcW w:type="dxa" w:w="2880"/>
+          </w:tcPr>
+          <w:p>
+            <w:r>
+              <w:t>`ofac-screening-schedule`</w:t>
+            </w:r>
+          </w:p>
+        </w:tc>
+        <w:tc>
+          <w:tcPr>
+            <w:tcW w:type="dxa" w:w="2880"/>
+          </w:tcPr>
+          <w:p>
+            <w:r>
+              <w:t>Prefix used for SNS topics created for schedule/email notifications.</w:t>
+            </w:r>
+          </w:p>
+        </w:tc>
+      </w:tr>
+      <w:tr>
+        <w:tc>
+          <w:tcPr>
+            <w:tcW w:type="dxa" w:w="2880"/>
+          </w:tcPr>
+          <w:p>
+            <w:r>
+              <w:t>`ACTIMIZE_MOCK`</w:t>
+            </w:r>
+          </w:p>
+        </w:tc>
+        <w:tc>
+          <w:tcPr>
+            <w:tcW w:type="dxa" w:w="2880"/>
+          </w:tcPr>
+          <w:p>
+            <w:r>
+              <w:t>`false`</w:t>
+            </w:r>
+          </w:p>
+        </w:tc>
+        <w:tc>
+          <w:tcPr>
+            <w:tcW w:type="dxa" w:w="2880"/>
+          </w:tcPr>
+          <w:p>
+            <w:r>
+              <w:t>If `true`, returns deterministic mock responses instead of calling Actimize.</w:t>
+            </w:r>
+          </w:p>
+        </w:tc>
+      </w:tr>
+      <w:tr>
+        <w:tc>
+          <w:tcPr>
+            <w:tcW w:type="dxa" w:w="2880"/>
+          </w:tcPr>
+          <w:p>
+            <w:r>
+              <w:t>`ACTIMIZE_BASE_URL`</w:t>
+            </w:r>
+          </w:p>
+        </w:tc>
+        <w:tc>
+          <w:tcPr>
+            <w:tcW w:type="dxa" w:w="2880"/>
+          </w:tcPr>
+          <w:p>
+            <w:r>
+              <w:t>*(empty)*</w:t>
+            </w:r>
+          </w:p>
+        </w:tc>
+        <w:tc>
+          <w:tcPr>
+            <w:tcW w:type="dxa" w:w="2880"/>
+          </w:tcPr>
+          <w:p>
+            <w:r>
+              <w:t>Base URL for Actimize screening API (required when not mocking).</w:t>
+            </w:r>
+          </w:p>
+        </w:tc>
+      </w:tr>
+      <w:tr>
+        <w:tc>
+          <w:tcPr>
+            <w:tcW w:type="dxa" w:w="2880"/>
+          </w:tcPr>
+          <w:p>
+            <w:r>
+              <w:t>`ACTIMIZE_PROVIDER`</w:t>
+            </w:r>
+          </w:p>
+        </w:tc>
+        <w:tc>
+          <w:tcPr>
+            <w:tcW w:type="dxa" w:w="2880"/>
+          </w:tcPr>
+          <w:p>
+            <w:r>
+              <w:t>`prudential`</w:t>
+            </w:r>
+          </w:p>
+        </w:tc>
+        <w:tc>
+          <w:tcPr>
+            <w:tcW w:type="dxa" w:w="2880"/>
+          </w:tcPr>
+          <w:p>
+            <w:r>
+              <w:t>Provider label used in audit/error telemetry.</w:t>
+            </w:r>
+          </w:p>
+        </w:tc>
+      </w:tr>
+      <w:tr>
+        <w:tc>
+          <w:tcPr>
+            <w:tcW w:type="dxa" w:w="2880"/>
+          </w:tcPr>
+          <w:p>
+            <w:r>
+              <w:t>`ACTIMIZE_API_KEY`</w:t>
+            </w:r>
+          </w:p>
+        </w:tc>
+        <w:tc>
+          <w:tcPr>
+            <w:tcW w:type="dxa" w:w="2880"/>
+          </w:tcPr>
+          <w:p>
+            <w:r>
+              <w:t>*(empty)*</w:t>
+            </w:r>
+          </w:p>
+        </w:tc>
+        <w:tc>
+          <w:tcPr>
+            <w:tcW w:type="dxa" w:w="2880"/>
+          </w:tcPr>
+          <w:p>
+            <w:r>
+              <w:t>Optional API key auth (sent via headers when configured).</w:t>
+            </w:r>
+          </w:p>
+        </w:tc>
+      </w:tr>
+      <w:tr>
+        <w:tc>
+          <w:tcPr>
+            <w:tcW w:type="dxa" w:w="2880"/>
+          </w:tcPr>
+          <w:p>
+            <w:r>
+              <w:t>`ACTIMIZE_BEARER_TOKEN`</w:t>
+            </w:r>
+          </w:p>
+        </w:tc>
+        <w:tc>
+          <w:tcPr>
+            <w:tcW w:type="dxa" w:w="2880"/>
+          </w:tcPr>
+          <w:p>
+            <w:r>
+              <w:t>*(empty)*</w:t>
+            </w:r>
+          </w:p>
+        </w:tc>
+        <w:tc>
+          <w:tcPr>
+            <w:tcW w:type="dxa" w:w="2880"/>
+          </w:tcPr>
+          <w:p>
+            <w:r>
+              <w:t>Optional static bearer token auth (sent via headers when configured).</w:t>
+            </w:r>
+          </w:p>
+        </w:tc>
+      </w:tr>
+      <w:tr>
+        <w:tc>
+          <w:tcPr>
+            <w:tcW w:type="dxa" w:w="2880"/>
+          </w:tcPr>
+          <w:p>
+            <w:r>
+              <w:t>`ACTIMIZE_TOKEN_URL`</w:t>
+            </w:r>
+          </w:p>
+        </w:tc>
+        <w:tc>
+          <w:tcPr>
+            <w:tcW w:type="dxa" w:w="2880"/>
+          </w:tcPr>
+          <w:p>
+            <w:r>
+              <w:t>*(empty)*</w:t>
+            </w:r>
+          </w:p>
+        </w:tc>
+        <w:tc>
+          <w:tcPr>
+            <w:tcW w:type="dxa" w:w="2880"/>
+          </w:tcPr>
+          <w:p>
+            <w:r>
+              <w:t>OAuth token endpoint for client-credentials (when using dynamic bearer tokens).</w:t>
+            </w:r>
+          </w:p>
+        </w:tc>
+      </w:tr>
+      <w:tr>
+        <w:tc>
+          <w:tcPr>
+            <w:tcW w:type="dxa" w:w="2880"/>
+          </w:tcPr>
+          <w:p>
+            <w:r>
+              <w:t>`ACTIMIZE_CLIENT_ID`</w:t>
+            </w:r>
+          </w:p>
+        </w:tc>
+        <w:tc>
+          <w:tcPr>
+            <w:tcW w:type="dxa" w:w="2880"/>
+          </w:tcPr>
+          <w:p>
+            <w:r>
+              <w:t>*(empty)*</w:t>
+            </w:r>
+          </w:p>
+        </w:tc>
+        <w:tc>
+          <w:tcPr>
+            <w:tcW w:type="dxa" w:w="2880"/>
+          </w:tcPr>
+          <w:p>
+            <w:r>
+              <w:t>OAuth client id (required if `ACTIMIZE_TOKEN_URL` is set).</w:t>
+            </w:r>
+          </w:p>
+        </w:tc>
+      </w:tr>
+      <w:tr>
+        <w:tc>
+          <w:tcPr>
+            <w:tcW w:type="dxa" w:w="2880"/>
+          </w:tcPr>
+          <w:p>
+            <w:r>
+              <w:t>`ACTIMIZE_CLIENT_SECRET`</w:t>
+            </w:r>
+          </w:p>
+        </w:tc>
+        <w:tc>
+          <w:tcPr>
+            <w:tcW w:type="dxa" w:w="2880"/>
+          </w:tcPr>
+          <w:p>
+            <w:r>
+              <w:t>*(empty)*</w:t>
+            </w:r>
+          </w:p>
+        </w:tc>
+        <w:tc>
+          <w:tcPr>
+            <w:tcW w:type="dxa" w:w="2880"/>
+          </w:tcPr>
+          <w:p>
+            <w:r>
+              <w:t>OAuth client secret (optional if using client assertion).</w:t>
+            </w:r>
+          </w:p>
+        </w:tc>
+      </w:tr>
+      <w:tr>
+        <w:tc>
+          <w:tcPr>
+            <w:tcW w:type="dxa" w:w="2880"/>
+          </w:tcPr>
+          <w:p>
+            <w:r>
+              <w:t>`ACTIMIZE_CLIENT_ASSERTION_TYPE`</w:t>
+            </w:r>
+          </w:p>
+        </w:tc>
+        <w:tc>
+          <w:tcPr>
+            <w:tcW w:type="dxa" w:w="2880"/>
+          </w:tcPr>
+          <w:p>
+            <w:r>
+              <w:t>`urn:ietf:params:oauth:client-assertion-type:jwt-bearer`</w:t>
+            </w:r>
+          </w:p>
+        </w:tc>
+        <w:tc>
+          <w:tcPr>
+            <w:tcW w:type="dxa" w:w="2880"/>
+          </w:tcPr>
+          <w:p>
+            <w:r>
+              <w:t>OAuth client assertion type when using JWT client assertion.</w:t>
+            </w:r>
+          </w:p>
+        </w:tc>
+      </w:tr>
+      <w:tr>
+        <w:tc>
+          <w:tcPr>
+            <w:tcW w:type="dxa" w:w="2880"/>
+          </w:tcPr>
+          <w:p>
+            <w:r>
+              <w:t>`ACTIMIZE_CLIENT_ASSERTION_ALGORITHM`</w:t>
+            </w:r>
+          </w:p>
+        </w:tc>
+        <w:tc>
+          <w:tcPr>
+            <w:tcW w:type="dxa" w:w="2880"/>
+          </w:tcPr>
+          <w:p>
+            <w:r>
+              <w:t>`RS256`</w:t>
+            </w:r>
+          </w:p>
+        </w:tc>
+        <w:tc>
+          <w:tcPr>
+            <w:tcW w:type="dxa" w:w="2880"/>
+          </w:tcPr>
+          <w:p>
+            <w:r>
+              <w:t>JWT signing algorithm for client assertion.</w:t>
+            </w:r>
+          </w:p>
+        </w:tc>
+      </w:tr>
+      <w:tr>
+        <w:tc>
+          <w:tcPr>
+            <w:tcW w:type="dxa" w:w="2880"/>
+          </w:tcPr>
+          <w:p>
+            <w:r>
+              <w:t>`ACTIMIZE_CLIENT_ASSERTION_AUDIENCE`</w:t>
+            </w:r>
+          </w:p>
+        </w:tc>
+        <w:tc>
+          <w:tcPr>
+            <w:tcW w:type="dxa" w:w="2880"/>
+          </w:tcPr>
+          <w:p>
+            <w:r>
+              <w:t>*(empty)*</w:t>
+            </w:r>
+          </w:p>
+        </w:tc>
+        <w:tc>
+          <w:tcPr>
+            <w:tcW w:type="dxa" w:w="2880"/>
+          </w:tcPr>
+          <w:p>
+            <w:r>
+              <w:t>JWT audience; defaults to `ACTIMIZE_TOKEN_URL` when unset.</w:t>
+            </w:r>
+          </w:p>
+        </w:tc>
+      </w:tr>
+      <w:tr>
+        <w:tc>
+          <w:tcPr>
+            <w:tcW w:type="dxa" w:w="2880"/>
+          </w:tcPr>
+          <w:p>
+            <w:r>
+              <w:t>`ACTIMIZE_CLIENT_ASSERTION_KID`</w:t>
+            </w:r>
+          </w:p>
+        </w:tc>
+        <w:tc>
+          <w:tcPr>
+            <w:tcW w:type="dxa" w:w="2880"/>
+          </w:tcPr>
+          <w:p>
+            <w:r>
+              <w:t>*(empty)*</w:t>
+            </w:r>
+          </w:p>
+        </w:tc>
+        <w:tc>
+          <w:tcPr>
+            <w:tcW w:type="dxa" w:w="2880"/>
+          </w:tcPr>
+          <w:p>
+            <w:r>
+              <w:t>Optional JWT header `kid` for key selection.</w:t>
+            </w:r>
+          </w:p>
+        </w:tc>
+      </w:tr>
+      <w:tr>
+        <w:tc>
+          <w:tcPr>
+            <w:tcW w:type="dxa" w:w="2880"/>
+          </w:tcPr>
+          <w:p>
+            <w:r>
+              <w:t>`ACTIMIZE_CLIENT_ASSERTION_PRIVATE_KEY`</w:t>
+            </w:r>
+          </w:p>
+        </w:tc>
+        <w:tc>
+          <w:tcPr>
+            <w:tcW w:type="dxa" w:w="2880"/>
+          </w:tcPr>
+          <w:p>
+            <w:r>
+              <w:t>*(empty)*</w:t>
+            </w:r>
+          </w:p>
+        </w:tc>
+        <w:tc>
+          <w:tcPr>
+            <w:tcW w:type="dxa" w:w="2880"/>
+          </w:tcPr>
+          <w:p>
+            <w:r>
+              <w:t>PEM private key for client assertion (inline).</w:t>
+            </w:r>
+          </w:p>
+        </w:tc>
+      </w:tr>
+      <w:tr>
+        <w:tc>
+          <w:tcPr>
+            <w:tcW w:type="dxa" w:w="2880"/>
+          </w:tcPr>
+          <w:p>
+            <w:r>
+              <w:t>`ACTIMIZE_CLIENT_ASSERTION_PRIVATE_KEY_B64`</w:t>
+            </w:r>
+          </w:p>
+        </w:tc>
+        <w:tc>
+          <w:tcPr>
+            <w:tcW w:type="dxa" w:w="2880"/>
+          </w:tcPr>
+          <w:p>
+            <w:r>
+              <w:t>*(empty)*</w:t>
+            </w:r>
+          </w:p>
+        </w:tc>
+        <w:tc>
+          <w:tcPr>
+            <w:tcW w:type="dxa" w:w="2880"/>
+          </w:tcPr>
+          <w:p>
+            <w:r>
+              <w:t>PEM private key for client assertion (base64-encoded).</w:t>
+            </w:r>
+          </w:p>
+        </w:tc>
+      </w:tr>
+      <w:tr>
+        <w:tc>
+          <w:tcPr>
+            <w:tcW w:type="dxa" w:w="2880"/>
+          </w:tcPr>
+          <w:p>
+            <w:r>
+              <w:t>`ACTIMIZE_CLIENT_ASSERTION_PRIVATE_KEY_PATH`</w:t>
+            </w:r>
+          </w:p>
+        </w:tc>
+        <w:tc>
+          <w:tcPr>
+            <w:tcW w:type="dxa" w:w="2880"/>
+          </w:tcPr>
+          <w:p>
+            <w:r>
+              <w:t>*(empty)*</w:t>
+            </w:r>
+          </w:p>
+        </w:tc>
+        <w:tc>
+          <w:tcPr>
+            <w:tcW w:type="dxa" w:w="2880"/>
+          </w:tcPr>
+          <w:p>
+            <w:r>
+              <w:t>PEM private key for client assertion (file path).</w:t>
+            </w:r>
+          </w:p>
+        </w:tc>
+      </w:tr>
+      <w:tr>
+        <w:tc>
+          <w:tcPr>
+            <w:tcW w:type="dxa" w:w="2880"/>
+          </w:tcPr>
+          <w:p>
+            <w:r>
+              <w:t>`ACTIMIZE_SCOPE`</w:t>
+            </w:r>
+          </w:p>
+        </w:tc>
+        <w:tc>
+          <w:tcPr>
+            <w:tcW w:type="dxa" w:w="2880"/>
+          </w:tcPr>
+          <w:p>
+            <w:r>
+              <w:t>*(empty)*</w:t>
+            </w:r>
+          </w:p>
+        </w:tc>
+        <w:tc>
+          <w:tcPr>
+            <w:tcW w:type="dxa" w:w="2880"/>
+          </w:tcPr>
+          <w:p>
+            <w:r>
+              <w:t>Optional OAuth scope string for token request.</w:t>
+            </w:r>
+          </w:p>
+        </w:tc>
+      </w:tr>
+      <w:tr>
+        <w:tc>
+          <w:tcPr>
+            <w:tcW w:type="dxa" w:w="2880"/>
+          </w:tcPr>
+          <w:p>
+            <w:r>
+              <w:t>`ACTIMIZE_SOURCE_SYSTEM`</w:t>
+            </w:r>
+          </w:p>
+        </w:tc>
+        <w:tc>
+          <w:tcPr>
+            <w:tcW w:type="dxa" w:w="2880"/>
+          </w:tcPr>
+          <w:p>
+            <w:r>
+              <w:t>`ZIP`</w:t>
+            </w:r>
+          </w:p>
+        </w:tc>
+        <w:tc>
+          <w:tcPr>
+            <w:tcW w:type="dxa" w:w="2880"/>
+          </w:tcPr>
+          <w:p>
+            <w:r>
+              <w:t>Sent in Actimize payload as `sourceSystem` and used when deriving fallback `partyKey`.</w:t>
+            </w:r>
+          </w:p>
+        </w:tc>
+      </w:tr>
+      <w:tr>
+        <w:tc>
+          <w:tcPr>
+            <w:tcW w:type="dxa" w:w="2880"/>
+          </w:tcPr>
+          <w:p>
+            <w:r>
+              <w:t>`ACTIMIZE_REQUESTER_NAME`</w:t>
+            </w:r>
+          </w:p>
+        </w:tc>
+        <w:tc>
+          <w:tcPr>
+            <w:tcW w:type="dxa" w:w="2880"/>
+          </w:tcPr>
+          <w:p>
+            <w:r>
+              <w:t>`SCREENING_SYSTEM`</w:t>
+            </w:r>
+          </w:p>
+        </w:tc>
+        <w:tc>
+          <w:tcPr>
+            <w:tcW w:type="dxa" w:w="2880"/>
+          </w:tcPr>
+          <w:p>
+            <w:r>
+              <w:t>Default requester name sent in Actimize payload when user name is not provided.</w:t>
+            </w:r>
+          </w:p>
+        </w:tc>
+      </w:tr>
+      <w:tr>
+        <w:tc>
+          <w:tcPr>
+            <w:tcW w:type="dxa" w:w="2880"/>
+          </w:tcPr>
+          <w:p>
+            <w:r>
+              <w:t>`ACTIMIZE_ALERT_REVIEW_URL`</w:t>
+            </w:r>
+          </w:p>
+        </w:tc>
+        <w:tc>
+          <w:tcPr>
+            <w:tcW w:type="dxa" w:w="2880"/>
+          </w:tcPr>
+          <w:p>
+            <w:r>
+              <w:t>*(empty)*</w:t>
+            </w:r>
+          </w:p>
+        </w:tc>
+        <w:tc>
+          <w:tcPr>
+            <w:tcW w:type="dxa" w:w="2880"/>
+          </w:tcPr>
+          <w:p>
+            <w:r>
+              <w:t>Optional URL included in scheduled completion notifications for where to review alerts.</w:t>
+            </w:r>
+          </w:p>
+        </w:tc>
+      </w:tr>
+      <w:tr>
+        <w:tc>
+          <w:tcPr>
+            <w:tcW w:type="dxa" w:w="2880"/>
+          </w:tcPr>
+          <w:p>
+            <w:r>
+              <w:t>`ACTIMIZE_TIMEOUT_S`</w:t>
+            </w:r>
+          </w:p>
+        </w:tc>
+        <w:tc>
+          <w:tcPr>
+            <w:tcW w:type="dxa" w:w="2880"/>
+          </w:tcPr>
+          <w:p>
+            <w:r>
+              <w:t>`10.0`</w:t>
+            </w:r>
+          </w:p>
+        </w:tc>
+        <w:tc>
+          <w:tcPr>
+            <w:tcW w:type="dxa" w:w="2880"/>
+          </w:tcPr>
+          <w:p>
+            <w:r>
+              <w:t>HTTP timeout (seconds) for Actimize requests.</w:t>
+            </w:r>
+          </w:p>
+        </w:tc>
+      </w:tr>
+      <w:tr>
+        <w:tc>
+          <w:tcPr>
+            <w:tcW w:type="dxa" w:w="2880"/>
+          </w:tcPr>
+          <w:p>
+            <w:r>
+              <w:t>`SCREENING_TPS`</w:t>
+            </w:r>
+          </w:p>
+        </w:tc>
+        <w:tc>
+          <w:tcPr>
+            <w:tcW w:type="dxa" w:w="2880"/>
+          </w:tcPr>
+          <w:p>
+            <w:r>
+              <w:t>`32`</w:t>
+            </w:r>
+          </w:p>
+        </w:tc>
+        <w:tc>
+          <w:tcPr>
+            <w:tcW w:type="dxa" w:w="2880"/>
+          </w:tcPr>
+          <w:p>
+            <w:r>
+              <w:t>Worker outbound throughput cap (TPS).</w:t>
+            </w:r>
+          </w:p>
+        </w:tc>
+      </w:tr>
+      <w:tr>
+        <w:tc>
+          <w:tcPr>
+            <w:tcW w:type="dxa" w:w="2880"/>
+          </w:tcPr>
+          <w:p>
+            <w:r>
+              <w:t>`SCREENING_POLL_INTERVAL_MS`</w:t>
+            </w:r>
+          </w:p>
+        </w:tc>
+        <w:tc>
+          <w:tcPr>
+            <w:tcW w:type="dxa" w:w="2880"/>
+          </w:tcPr>
+          <w:p>
+            <w:r>
+              <w:t>`750`</w:t>
+            </w:r>
+          </w:p>
+        </w:tc>
+        <w:tc>
+          <w:tcPr>
+            <w:tcW w:type="dxa" w:w="2880"/>
+          </w:tcPr>
+          <w:p>
+            <w:r>
+              <w:t>Intended poll interval (ms) used by clients/UX; backend uses it for any internal timing where applicable.</w:t>
+            </w:r>
+          </w:p>
+        </w:tc>
+      </w:tr>
+      <w:tr>
+        <w:tc>
+          <w:tcPr>
+            <w:tcW w:type="dxa" w:w="2880"/>
+          </w:tcPr>
+          <w:p>
+            <w:r>
+              <w:t>`SCREENING_SYNC_TIMEOUT_S`</w:t>
+            </w:r>
+          </w:p>
+        </w:tc>
+        <w:tc>
+          <w:tcPr>
+            <w:tcW w:type="dxa" w:w="2880"/>
+          </w:tcPr>
+          <w:p>
+            <w:r>
+              <w:t>`60`</w:t>
+            </w:r>
+          </w:p>
+        </w:tc>
+        <w:tc>
+          <w:tcPr>
+            <w:tcW w:type="dxa" w:w="2880"/>
+          </w:tcPr>
+          <w:p>
+            <w:r>
+              <w:t>Timeout budget (seconds) for synchronous screening request flows.</w:t>
+            </w:r>
+          </w:p>
+        </w:tc>
+      </w:tr>
+      <w:tr>
+        <w:tc>
+          <w:tcPr>
+            <w:tcW w:type="dxa" w:w="2880"/>
+          </w:tcPr>
+          <w:p>
+            <w:r>
+              <w:t>`SCREENING_RESULT_LIMIT`</w:t>
+            </w:r>
+          </w:p>
+        </w:tc>
+        <w:tc>
+          <w:tcPr>
+            <w:tcW w:type="dxa" w:w="2880"/>
+          </w:tcPr>
+          <w:p>
+            <w:r>
+              <w:t>`5`</w:t>
+            </w:r>
+          </w:p>
+        </w:tc>
+        <w:tc>
+          <w:tcPr>
+            <w:tcW w:type="dxa" w:w="2880"/>
+          </w:tcPr>
+          <w:p>
+            <w:r>
+              <w:t>Default max number of matches returned per item.</w:t>
+            </w:r>
+          </w:p>
+        </w:tc>
+      </w:tr>
+      <w:tr>
+        <w:tc>
+          <w:tcPr>
+            <w:tcW w:type="dxa" w:w="2880"/>
+          </w:tcPr>
+          <w:p>
+            <w:r>
+              <w:t>`DAILY_SCREENING_TIMEZONE`</w:t>
+            </w:r>
+          </w:p>
+        </w:tc>
+        <w:tc>
+          <w:tcPr>
+            <w:tcW w:type="dxa" w:w="2880"/>
+          </w:tcPr>
+          <w:p>
+            <w:r>
+              <w:t>`America/New_York`</w:t>
+            </w:r>
+          </w:p>
+        </w:tc>
+        <w:tc>
+          <w:tcPr>
+            <w:tcW w:type="dxa" w:w="2880"/>
+          </w:tcPr>
+          <w:p>
+            <w:r>
+              <w:t>Timezone for schedule calculations.</w:t>
+            </w:r>
+          </w:p>
+        </w:tc>
+      </w:tr>
+      <w:tr>
+        <w:tc>
+          <w:tcPr>
+            <w:tcW w:type="dxa" w:w="2880"/>
+          </w:tcPr>
+          <w:p>
+            <w:r>
+              <w:t>`DAILY_SCREENING_HOUR`</w:t>
+            </w:r>
+          </w:p>
+        </w:tc>
+        <w:tc>
+          <w:tcPr>
+            <w:tcW w:type="dxa" w:w="2880"/>
+          </w:tcPr>
+          <w:p>
+            <w:r>
+              <w:t>`0`</w:t>
+            </w:r>
+          </w:p>
+        </w:tc>
+        <w:tc>
+          <w:tcPr>
+            <w:tcW w:type="dxa" w:w="2880"/>
+          </w:tcPr>
+          <w:p>
+            <w:r>
+              <w:t>Hour-of-day for default daily schedule run time (local to `DAILY_SCREENING_TIMEZONE`).</w:t>
+            </w:r>
+          </w:p>
+        </w:tc>
+      </w:tr>
+      <w:tr>
+        <w:tc>
+          <w:tcPr>
+            <w:tcW w:type="dxa" w:w="2880"/>
+          </w:tcPr>
+          <w:p>
+            <w:r>
+              <w:t>`DAILY_SCREENING_MINUTE`</w:t>
+            </w:r>
+          </w:p>
+        </w:tc>
+        <w:tc>
+          <w:tcPr>
+            <w:tcW w:type="dxa" w:w="2880"/>
+          </w:tcPr>
+          <w:p>
+            <w:r>
+              <w:t>`5`</w:t>
+            </w:r>
+          </w:p>
+        </w:tc>
+        <w:tc>
+          <w:tcPr>
+            <w:tcW w:type="dxa" w:w="2880"/>
+          </w:tcPr>
+          <w:p>
+            <w:r>
+              <w:t>Minute-of-hour for default daily schedule run time.</w:t>
+            </w:r>
+          </w:p>
+        </w:tc>
+      </w:tr>
+      <w:tr>
+        <w:tc>
+          <w:tcPr>
+            <w:tcW w:type="dxa" w:w="2880"/>
+          </w:tcPr>
+          <w:p>
+            <w:r>
+              <w:t>`DAILY_SCREENING_CHECK_INTERVAL_S`</w:t>
+            </w:r>
+          </w:p>
+        </w:tc>
+        <w:tc>
+          <w:tcPr>
+            <w:tcW w:type="dxa" w:w="2880"/>
+          </w:tcPr>
+          <w:p>
+            <w:r>
+              <w:t>`30`</w:t>
+            </w:r>
+          </w:p>
+        </w:tc>
+        <w:tc>
+          <w:tcPr>
+            <w:tcW w:type="dxa" w:w="2880"/>
+          </w:tcPr>
+          <w:p>
+            <w:r>
+              <w:t>How often the worker checks for due schedules.</w:t>
+            </w:r>
+          </w:p>
+        </w:tc>
+      </w:tr>
+      <w:tr>
+        <w:tc>
+          <w:tcPr>
+            <w:tcW w:type="dxa" w:w="2880"/>
+          </w:tcPr>
+          <w:p>
+            <w:r>
+              <w:t>`AUDIT_ACCESS_LOG_ENABLED`</w:t>
+            </w:r>
+          </w:p>
+        </w:tc>
+        <w:tc>
+          <w:tcPr>
+            <w:tcW w:type="dxa" w:w="2880"/>
+          </w:tcPr>
+          <w:p>
+            <w:r>
+              <w:t>`true`</w:t>
+            </w:r>
+          </w:p>
+        </w:tc>
+        <w:tc>
+          <w:tcPr>
+            <w:tcW w:type="dxa" w:w="2880"/>
+          </w:tcPr>
+          <w:p>
+            <w:r>
+              <w:t>Enables middleware access logging into `api_access_logs`.</w:t>
+            </w:r>
+          </w:p>
+        </w:tc>
+      </w:tr>
+      <w:tr>
+        <w:tc>
+          <w:tcPr>
+            <w:tcW w:type="dxa" w:w="2880"/>
+          </w:tcPr>
+          <w:p>
+            <w:r>
+              <w:t>`AUDIT_EVENT_RETENTION_DAYS`</w:t>
+            </w:r>
+          </w:p>
+        </w:tc>
+        <w:tc>
+          <w:tcPr>
+            <w:tcW w:type="dxa" w:w="2880"/>
+          </w:tcPr>
+          <w:p>
+            <w:r>
+              <w:t>`3650`</w:t>
+            </w:r>
+          </w:p>
+        </w:tc>
+        <w:tc>
+          <w:tcPr>
+            <w:tcW w:type="dxa" w:w="2880"/>
+          </w:tcPr>
+          <w:p>
+            <w:r>
+              <w:t>Retention window for `audit_events` cleanup.</w:t>
+            </w:r>
+          </w:p>
+        </w:tc>
+      </w:tr>
+      <w:tr>
+        <w:tc>
+          <w:tcPr>
+            <w:tcW w:type="dxa" w:w="2880"/>
+          </w:tcPr>
+          <w:p>
+            <w:r>
+              <w:t>`API_ACCESS_LOG_RETENTION_DAYS`</w:t>
+            </w:r>
+          </w:p>
+        </w:tc>
+        <w:tc>
+          <w:tcPr>
+            <w:tcW w:type="dxa" w:w="2880"/>
+          </w:tcPr>
+          <w:p>
+            <w:r>
+              <w:t>`365`</w:t>
+            </w:r>
+          </w:p>
+        </w:tc>
+        <w:tc>
+          <w:tcPr>
+            <w:tcW w:type="dxa" w:w="2880"/>
+          </w:tcPr>
+          <w:p>
+            <w:r>
+              <w:t>Retention window for `api_access_logs` cleanup.</w:t>
+            </w:r>
+          </w:p>
+        </w:tc>
+      </w:tr>
+      <w:tr>
+        <w:tc>
+          <w:tcPr>
+            <w:tcW w:type="dxa" w:w="2880"/>
+          </w:tcPr>
+          <w:p>
+            <w:r>
+              <w:t>`EXTERNAL_API_ERROR_RETENTION_DAYS`</w:t>
+            </w:r>
+          </w:p>
+        </w:tc>
+        <w:tc>
+          <w:tcPr>
+            <w:tcW w:type="dxa" w:w="2880"/>
+          </w:tcPr>
+          <w:p>
+            <w:r>
+              <w:t>`365`</w:t>
+            </w:r>
+          </w:p>
+        </w:tc>
+        <w:tc>
+          <w:tcPr>
+            <w:tcW w:type="dxa" w:w="2880"/>
+          </w:tcPr>
+          <w:p>
+            <w:r>
+              <w:t>Retention window for `external_api_errors` cleanup.</w:t>
+            </w:r>
+          </w:p>
+        </w:tc>
+      </w:tr>
+      <w:tr>
+        <w:tc>
+          <w:tcPr>
+            <w:tcW w:type="dxa" w:w="2880"/>
+          </w:tcPr>
+          <w:p>
+            <w:r>
+              <w:t>`OPERATIONAL_CLEANUP_INTERVAL_S`</w:t>
+            </w:r>
+          </w:p>
+        </w:tc>
+        <w:tc>
+          <w:tcPr>
+            <w:tcW w:type="dxa" w:w="2880"/>
+          </w:tcPr>
+          <w:p>
+            <w:r>
+              <w:t>`3600`</w:t>
+            </w:r>
+          </w:p>
+        </w:tc>
+        <w:tc>
+          <w:tcPr>
+            <w:tcW w:type="dxa" w:w="2880"/>
+          </w:tcPr>
+          <w:p>
+            <w:r>
+              <w:t>How often the worker purges old operational data.</w:t>
+            </w:r>
+          </w:p>
+        </w:tc>
+      </w:tr>
+      <w:tr>
+        <w:tc>
+          <w:tcPr>
+            <w:tcW w:type="dxa" w:w="2880"/>
+          </w:tcPr>
+          <w:p>
+            <w:r>
+              <w:t>`HIGH_RISK_EXTERNAL_API_ERROR_WINDOW_MINUTES`</w:t>
+            </w:r>
+          </w:p>
+        </w:tc>
+        <w:tc>
+          <w:tcPr>
+            <w:tcW w:type="dxa" w:w="2880"/>
+          </w:tcPr>
+          <w:p>
+            <w:r>
+              <w:t>`15`</w:t>
+            </w:r>
+          </w:p>
+        </w:tc>
+        <w:tc>
+          <w:tcPr>
+            <w:tcW w:type="dxa" w:w="2880"/>
+          </w:tcPr>
+          <w:p>
+            <w:r>
+              <w:t>Rolling window for high-risk external API failure detection.</w:t>
+            </w:r>
+          </w:p>
+        </w:tc>
+      </w:tr>
+      <w:tr>
+        <w:tc>
+          <w:tcPr>
+            <w:tcW w:type="dxa" w:w="2880"/>
+          </w:tcPr>
+          <w:p>
+            <w:r>
+              <w:t>`HIGH_RISK_EXTERNAL_API_ERROR_THRESHOLD`</w:t>
+            </w:r>
+          </w:p>
+        </w:tc>
+        <w:tc>
+          <w:tcPr>
+            <w:tcW w:type="dxa" w:w="2880"/>
+          </w:tcPr>
+          <w:p>
+            <w:r>
+              <w:t>`10`</w:t>
+            </w:r>
+          </w:p>
+        </w:tc>
+        <w:tc>
+          <w:tcPr>
+            <w:tcW w:type="dxa" w:w="2880"/>
+          </w:tcPr>
+          <w:p>
+            <w:r>
+              <w:t>Threshold count inside the window that triggers high-risk alert audit events.</w:t>
+            </w:r>
+          </w:p>
+        </w:tc>
+      </w:tr>
+      <w:tr>
+        <w:tc>
+          <w:tcPr>
+            <w:tcW w:type="dxa" w:w="2880"/>
+          </w:tcPr>
+          <w:p>
+            <w:r>
+              <w:t>`AUTH_ENABLED`</w:t>
+            </w:r>
+          </w:p>
+        </w:tc>
+        <w:tc>
+          <w:tcPr>
+            <w:tcW w:type="dxa" w:w="2880"/>
+          </w:tcPr>
+          <w:p>
+            <w:r>
+              <w:t>`false`</w:t>
+            </w:r>
+          </w:p>
+        </w:tc>
+        <w:tc>
+          <w:tcPr>
+            <w:tcW w:type="dxa" w:w="2880"/>
+          </w:tcPr>
+          <w:p>
+            <w:r>
+              <w:t>Enables JWT validation + permission enforcement for `/api/v1/*`.</w:t>
+            </w:r>
+          </w:p>
+        </w:tc>
+      </w:tr>
+      <w:tr>
+        <w:tc>
+          <w:tcPr>
+            <w:tcW w:type="dxa" w:w="2880"/>
+          </w:tcPr>
+          <w:p>
+            <w:r>
+              <w:t>`AUTH_ISSUER`</w:t>
+            </w:r>
+          </w:p>
+        </w:tc>
+        <w:tc>
+          <w:tcPr>
+            <w:tcW w:type="dxa" w:w="2880"/>
+          </w:tcPr>
+          <w:p>
+            <w:r>
+              <w:t>*(empty)*</w:t>
+            </w:r>
+          </w:p>
+        </w:tc>
+        <w:tc>
+          <w:tcPr>
+            <w:tcW w:type="dxa" w:w="2880"/>
+          </w:tcPr>
+          <w:p>
+            <w:r>
+              <w:t>JWT issuer URL. Required when `AUTH_ENABLED=true`.</w:t>
+            </w:r>
+          </w:p>
+        </w:tc>
+      </w:tr>
+      <w:tr>
+        <w:tc>
+          <w:tcPr>
+            <w:tcW w:type="dxa" w:w="2880"/>
+          </w:tcPr>
+          <w:p>
+            <w:r>
+              <w:t>`AUTH_JWKS_URL`</w:t>
+            </w:r>
+          </w:p>
+        </w:tc>
+        <w:tc>
+          <w:tcPr>
+            <w:tcW w:type="dxa" w:w="2880"/>
+          </w:tcPr>
+          <w:p>
+            <w:r>
+              <w:t>*(empty)*</w:t>
+            </w:r>
+          </w:p>
+        </w:tc>
+        <w:tc>
+          <w:tcPr>
+            <w:tcW w:type="dxa" w:w="2880"/>
+          </w:tcPr>
+          <w:p>
+            <w:r>
+              <w:t>JWKS URL for signature verification. Required when `AUTH_ENABLED=true`.</w:t>
+            </w:r>
+          </w:p>
+        </w:tc>
+      </w:tr>
+      <w:tr>
+        <w:tc>
+          <w:tcPr>
+            <w:tcW w:type="dxa" w:w="2880"/>
+          </w:tcPr>
+          <w:p>
+            <w:r>
+              <w:t>`AUTH_AUDIENCE`</w:t>
+            </w:r>
+          </w:p>
+        </w:tc>
+        <w:tc>
+          <w:tcPr>
+            <w:tcW w:type="dxa" w:w="2880"/>
+          </w:tcPr>
+          <w:p>
+            <w:r>
+              <w:t>*(empty)*</w:t>
+            </w:r>
+          </w:p>
+        </w:tc>
+        <w:tc>
+          <w:tcPr>
+            <w:tcW w:type="dxa" w:w="2880"/>
+          </w:tcPr>
+          <w:p>
+            <w:r>
+              <w:t>JWT audience/app-client id (required for Cognito access tokens).</w:t>
+            </w:r>
+          </w:p>
+        </w:tc>
+      </w:tr>
+      <w:tr>
+        <w:tc>
+          <w:tcPr>
+            <w:tcW w:type="dxa" w:w="2880"/>
+          </w:tcPr>
+          <w:p>
+            <w:r>
+              <w:t>`AUTH_ALGORITHMS`</w:t>
+            </w:r>
+          </w:p>
+        </w:tc>
+        <w:tc>
+          <w:tcPr>
+            <w:tcW w:type="dxa" w:w="2880"/>
+          </w:tcPr>
+          <w:p>
+            <w:r>
+              <w:t>`RS256`</w:t>
+            </w:r>
+          </w:p>
+        </w:tc>
+        <w:tc>
+          <w:tcPr>
+            <w:tcW w:type="dxa" w:w="2880"/>
+          </w:tcPr>
+          <w:p>
+            <w:r>
+              <w:t>Allowed JWT signing algorithms.</w:t>
+            </w:r>
+          </w:p>
+        </w:tc>
+      </w:tr>
+    </w:tbl>
     <w:p>
       <w:pPr>
         <w:pStyle w:val="Heading2"/>

</xml_diff>

<commit_message>
3 digit Iso country code display fix in UI
</commit_message>
<xml_diff>
--- a/docs/technical-design-document.docx
+++ b/docs/technical-design-document.docx
@@ -19,7 +19,7 @@
         <w:t>Version:</w:t>
       </w:r>
       <w:r>
-        <w:t xml:space="preserve"> 2.2 </w:t>
+        <w:t xml:space="preserve"> 2.3 </w:t>
       </w:r>
       <w:r>
         <w:rPr>
@@ -28,7 +28,7 @@
         <w:t>Date:</w:t>
       </w:r>
       <w:r>
-        <w:t xml:space="preserve"> 2026-05-19 </w:t>
+        <w:t xml:space="preserve"> 2026-05-20 </w:t>
       </w:r>
       <w:r>
         <w:rPr>
@@ -138,7 +138,7 @@
           </w:tcPr>
           <w:p>
             <w:r>
-              <w:t>2.2</w:t>
+              <w:t>2.3</w:t>
             </w:r>
           </w:p>
         </w:tc>
@@ -160,7 +160,7 @@
           </w:tcPr>
           <w:p>
             <w:r>
-              <w:t>2026-05-19</w:t>
+              <w:t>2026-05-20</w:t>
             </w:r>
           </w:p>
         </w:tc>
@@ -321,6 +321,38 @@
           </w:tcPr>
           <w:p>
             <w:r>
+              <w:t>2.3</w:t>
+            </w:r>
+          </w:p>
+        </w:tc>
+        <w:tc>
+          <w:tcPr>
+            <w:tcW w:type="dxa" w:w="2880"/>
+          </w:tcPr>
+          <w:p>
+            <w:r>
+              <w:t>2026-05-20</w:t>
+            </w:r>
+          </w:p>
+        </w:tc>
+        <w:tc>
+          <w:tcPr>
+            <w:tcW w:type="dxa" w:w="2880"/>
+          </w:tcPr>
+          <w:p>
+            <w:r>
+              <w:t>Added detailed field-mapping documentation for single screening and batch screening (Excel/CSV to internal payload to Actimize request payload).</w:t>
+            </w:r>
+          </w:p>
+        </w:tc>
+      </w:tr>
+      <w:tr>
+        <w:tc>
+          <w:tcPr>
+            <w:tcW w:type="dxa" w:w="2880"/>
+          </w:tcPr>
+          <w:p>
+            <w:r>
               <w:t>2.2</w:t>
             </w:r>
           </w:p>
@@ -1225,6 +1257,14 @@
       </w:pPr>
       <w:r>
         <w:t>Added explicit OIDC authentication, Actimize authentication, and API flow documentation for review.</w:t>
+      </w:r>
+    </w:p>
+    <w:p>
+      <w:pPr>
+        <w:pStyle w:val="ListBullet"/>
+      </w:pPr>
+      <w:r>
+        <w:t>Added explicit single-screening and batch-screening field mapping tables from source input through Actimize request construction.</w:t>
       </w:r>
     </w:p>
     <w:p>
@@ -5614,7 +5654,15 @@
     <w:p>
       <w:pPr/>
       <w:r>
-        <w:t>Actimize request construction preserves structured identity data:</w:t>
+        <w:t>Actimize request construction preserves structured identity data and follows the mapping below.</w:t>
+      </w:r>
+    </w:p>
+    <w:p>
+      <w:pPr>
+        <w:pStyle w:val="Heading3"/>
+      </w:pPr>
+      <w:r>
+        <w:t>9.1 Single Screening Field Mapping</w:t>
       </w:r>
     </w:p>
     <w:tbl>
@@ -5624,33 +5672,61 @@
         <w:tblLook w:firstColumn="1" w:firstRow="1" w:lastColumn="0" w:lastRow="0" w:noHBand="0" w:noVBand="1" w:val="04A0"/>
       </w:tblPr>
       <w:tblGrid>
-        <w:gridCol w:w="4320"/>
-        <w:gridCol w:w="4320"/>
+        <w:gridCol w:w="2160"/>
+        <w:gridCol w:w="2160"/>
+        <w:gridCol w:w="2160"/>
+        <w:gridCol w:w="2160"/>
       </w:tblGrid>
       <w:tr>
         <w:tc>
           <w:tcPr>
-            <w:tcW w:type="dxa" w:w="4320"/>
+            <w:tcW w:type="dxa" w:w="2160"/>
           </w:tcPr>
           <w:p>
             <w:r>
               <w:rPr>
                 <w:b/>
               </w:rPr>
-              <w:t>Source Field</w:t>
-            </w:r>
-          </w:p>
-        </w:tc>
-        <w:tc>
-          <w:tcPr>
-            <w:tcW w:type="dxa" w:w="4320"/>
+              <w:t>Single Screening Source</w:t>
+            </w:r>
+          </w:p>
+        </w:tc>
+        <w:tc>
+          <w:tcPr>
+            <w:tcW w:type="dxa" w:w="2160"/>
           </w:tcPr>
           <w:p>
             <w:r>
               <w:rPr>
                 <w:b/>
               </w:rPr>
-              <w:t>Actimize Target</w:t>
+              <w:t>Internal Request (`queries[*].properties`)</w:t>
+            </w:r>
+          </w:p>
+        </w:tc>
+        <w:tc>
+          <w:tcPr>
+            <w:tcW w:type="dxa" w:w="2160"/>
+          </w:tcPr>
+          <w:p>
+            <w:r>
+              <w:rPr>
+                <w:b/>
+              </w:rPr>
+              <w:t>Actimize Request Field</w:t>
+            </w:r>
+          </w:p>
+        </w:tc>
+        <w:tc>
+          <w:tcPr>
+            <w:tcW w:type="dxa" w:w="2160"/>
+          </w:tcPr>
+          <w:p>
+            <w:r>
+              <w:rPr>
+                <w:b/>
+              </w:rPr>
+              <w:t>Mapping Rule</w:t>
             </w:r>
           </w:p>
         </w:tc>
@@ -5658,21 +5734,41 @@
       <w:tr>
         <w:tc>
           <w:tcPr>
-            <w:tcW w:type="dxa" w:w="4320"/>
-          </w:tcPr>
-          <w:p>
-            <w:r>
-              <w:t>`properties.partyKey`</w:t>
-            </w:r>
-          </w:p>
-        </w:tc>
-        <w:tc>
-          <w:tcPr>
-            <w:tcW w:type="dxa" w:w="4320"/>
-          </w:tcPr>
-          <w:p>
-            <w:r>
-              <w:t>`partyKey`</w:t>
+            <w:tcW w:type="dxa" w:w="2160"/>
+          </w:tcPr>
+          <w:p>
+            <w:r>
+              <w:t>Screening Type picker (`SAN-US`, `PEP`, `AME`, etc.)</w:t>
+            </w:r>
+          </w:p>
+        </w:tc>
+        <w:tc>
+          <w:tcPr>
+            <w:tcW w:type="dxa" w:w="2160"/>
+          </w:tcPr>
+          <w:p>
+            <w:r>
+              <w:t>Top-level `screening_types[]`</w:t>
+            </w:r>
+          </w:p>
+        </w:tc>
+        <w:tc>
+          <w:tcPr>
+            <w:tcW w:type="dxa" w:w="2160"/>
+          </w:tcPr>
+          <w:p>
+            <w:r>
+              <w:t>`screeningType`</w:t>
+            </w:r>
+          </w:p>
+        </w:tc>
+        <w:tc>
+          <w:tcPr>
+            <w:tcW w:type="dxa" w:w="2160"/>
+          </w:tcPr>
+          <w:p>
+            <w:r>
+              <w:t>Each selected screening type is resolved through `actimize_screening_type_mappings` to active `Search_Definition_ID`.</w:t>
             </w:r>
           </w:p>
         </w:tc>
@@ -5680,21 +5776,41 @@
       <w:tr>
         <w:tc>
           <w:tcPr>
-            <w:tcW w:type="dxa" w:w="4320"/>
-          </w:tcPr>
-          <w:p>
-            <w:r>
-              <w:t>`schema`</w:t>
-            </w:r>
-          </w:p>
-        </w:tc>
-        <w:tc>
-          <w:tcPr>
-            <w:tcW w:type="dxa" w:w="4320"/>
-          </w:tcPr>
-          <w:p>
-            <w:r>
-              <w:t>`partyType` (`I` for person, `E` for entity)</w:t>
+            <w:tcW w:type="dxa" w:w="2160"/>
+          </w:tcPr>
+          <w:p>
+            <w:r>
+              <w:t>Business Unit picker</w:t>
+            </w:r>
+          </w:p>
+        </w:tc>
+        <w:tc>
+          <w:tcPr>
+            <w:tcW w:type="dxa" w:w="2160"/>
+          </w:tcPr>
+          <w:p>
+            <w:r>
+              <w:t>Top-level `business_unit_code` and `properties.businessUnit`</w:t>
+            </w:r>
+          </w:p>
+        </w:tc>
+        <w:tc>
+          <w:tcPr>
+            <w:tcW w:type="dxa" w:w="2160"/>
+          </w:tcPr>
+          <w:p>
+            <w:r>
+              <w:t>`businessUnit`</w:t>
+            </w:r>
+          </w:p>
+        </w:tc>
+        <w:tc>
+          <w:tcPr>
+            <w:tcW w:type="dxa" w:w="2160"/>
+          </w:tcPr>
+          <w:p>
+            <w:r>
+              <w:t>Business unit is required and validated against user-to-BU mapping before call submission.</w:t>
             </w:r>
           </w:p>
         </w:tc>
@@ -5702,21 +5818,41 @@
       <w:tr>
         <w:tc>
           <w:tcPr>
-            <w:tcW w:type="dxa" w:w="4320"/>
-          </w:tcPr>
-          <w:p>
-            <w:r>
-              <w:t>`firstName`, `middleName`, `lastName`, `maidenName`, `fullName`</w:t>
-            </w:r>
-          </w:p>
-        </w:tc>
-        <w:tc>
-          <w:tcPr>
-            <w:tcW w:type="dxa" w:w="4320"/>
-          </w:tcPr>
-          <w:p>
-            <w:r>
-              <w:t>`names`</w:t>
+            <w:tcW w:type="dxa" w:w="2160"/>
+          </w:tcPr>
+          <w:p>
+            <w:r>
+              <w:t>First/Middle/Last/Full Name</w:t>
+            </w:r>
+          </w:p>
+        </w:tc>
+        <w:tc>
+          <w:tcPr>
+            <w:tcW w:type="dxa" w:w="2160"/>
+          </w:tcPr>
+          <w:p>
+            <w:r>
+              <w:t>`name[]`, `firstName[]`, `middleName[]`, `lastName[]`, `fullName[]`</w:t>
+            </w:r>
+          </w:p>
+        </w:tc>
+        <w:tc>
+          <w:tcPr>
+            <w:tcW w:type="dxa" w:w="2160"/>
+          </w:tcPr>
+          <w:p>
+            <w:r>
+              <w:t>`names.firstName`, `names.middleName`, `names.lastName`, `names.fullName`</w:t>
+            </w:r>
+          </w:p>
+        </w:tc>
+        <w:tc>
+          <w:tcPr>
+            <w:tcW w:type="dxa" w:w="2160"/>
+          </w:tcPr>
+          <w:p>
+            <w:r>
+              <w:t>Individual requests keep split name fields and full name. Non-individual requests map `fullName` only.</w:t>
             </w:r>
           </w:p>
         </w:tc>
@@ -5724,21 +5860,41 @@
       <w:tr>
         <w:tc>
           <w:tcPr>
-            <w:tcW w:type="dxa" w:w="4320"/>
-          </w:tcPr>
-          <w:p>
-            <w:r>
-              <w:t>`alias`, `aliases`</w:t>
-            </w:r>
-          </w:p>
-        </w:tc>
-        <w:tc>
-          <w:tcPr>
-            <w:tcW w:type="dxa" w:w="4320"/>
+            <w:tcW w:type="dxa" w:w="2160"/>
+          </w:tcPr>
+          <w:p>
+            <w:r>
+              <w:t>Alias free text and additional AKA entries</w:t>
+            </w:r>
+          </w:p>
+        </w:tc>
+        <w:tc>
+          <w:tcPr>
+            <w:tcW w:type="dxa" w:w="2160"/>
+          </w:tcPr>
+          <w:p>
+            <w:r>
+              <w:t>`alias[]` and `aliases[]`</w:t>
+            </w:r>
+          </w:p>
+        </w:tc>
+        <w:tc>
+          <w:tcPr>
+            <w:tcW w:type="dxa" w:w="2160"/>
           </w:tcPr>
           <w:p>
             <w:r>
               <w:t>`aliases[]`</w:t>
+            </w:r>
+          </w:p>
+        </w:tc>
+        <w:tc>
+          <w:tcPr>
+            <w:tcW w:type="dxa" w:w="2160"/>
+          </w:tcPr>
+          <w:p>
+            <w:r>
+              <w:t>Structured alias objects are preserved and deduplicated.</w:t>
             </w:r>
           </w:p>
         </w:tc>
@@ -5746,21 +5902,41 @@
       <w:tr>
         <w:tc>
           <w:tcPr>
-            <w:tcW w:type="dxa" w:w="4320"/>
-          </w:tcPr>
-          <w:p>
-            <w:r>
-              <w:t>`nationality`, `country`</w:t>
-            </w:r>
-          </w:p>
-        </w:tc>
-        <w:tc>
-          <w:tcPr>
-            <w:tcW w:type="dxa" w:w="4320"/>
-          </w:tcPr>
-          <w:p>
-            <w:r>
-              <w:t>`nationalities[]`</w:t>
+            <w:tcW w:type="dxa" w:w="2160"/>
+          </w:tcPr>
+          <w:p>
+            <w:r>
+              <w:t>Nationality/Country selections</w:t>
+            </w:r>
+          </w:p>
+        </w:tc>
+        <w:tc>
+          <w:tcPr>
+            <w:tcW w:type="dxa" w:w="2160"/>
+          </w:tcPr>
+          <w:p>
+            <w:r>
+              <w:t>`nationality[]` (person) or `country[]` (non-person)</w:t>
+            </w:r>
+          </w:p>
+        </w:tc>
+        <w:tc>
+          <w:tcPr>
+            <w:tcW w:type="dxa" w:w="2160"/>
+          </w:tcPr>
+          <w:p>
+            <w:r>
+              <w:t>`nationalities[].country`</w:t>
+            </w:r>
+          </w:p>
+        </w:tc>
+        <w:tc>
+          <w:tcPr>
+            <w:tcW w:type="dxa" w:w="2160"/>
+          </w:tcPr>
+          <w:p>
+            <w:r>
+              <w:t>Country values are passed through as provided by frontend (ISO3 dropdown values).</w:t>
             </w:r>
           </w:p>
         </w:tc>
@@ -5768,21 +5944,41 @@
       <w:tr>
         <w:tc>
           <w:tcPr>
-            <w:tcW w:type="dxa" w:w="4320"/>
-          </w:tcPr>
-          <w:p>
-            <w:r>
-              <w:t>`address`</w:t>
-            </w:r>
-          </w:p>
-        </w:tc>
-        <w:tc>
-          <w:tcPr>
-            <w:tcW w:type="dxa" w:w="4320"/>
-          </w:tcPr>
-          <w:p>
-            <w:r>
-              <w:t>`addresses[]`</w:t>
+            <w:tcW w:type="dxa" w:w="2160"/>
+          </w:tcPr>
+          <w:p>
+            <w:r>
+              <w:t>Address inputs</w:t>
+            </w:r>
+          </w:p>
+        </w:tc>
+        <w:tc>
+          <w:tcPr>
+            <w:tcW w:type="dxa" w:w="2160"/>
+          </w:tcPr>
+          <w:p>
+            <w:r>
+              <w:t>`address[]`</w:t>
+            </w:r>
+          </w:p>
+        </w:tc>
+        <w:tc>
+          <w:tcPr>
+            <w:tcW w:type="dxa" w:w="2160"/>
+          </w:tcPr>
+          <w:p>
+            <w:r>
+              <w:t>`addresses[].street1`</w:t>
+            </w:r>
+          </w:p>
+        </w:tc>
+        <w:tc>
+          <w:tcPr>
+            <w:tcW w:type="dxa" w:w="2160"/>
+          </w:tcPr>
+          <w:p>
+            <w:r>
+              <w:t>Each address line is sent as one address object; optional country is derived from available country list.</w:t>
             </w:r>
           </w:p>
         </w:tc>
@@ -5790,21 +5986,41 @@
       <w:tr>
         <w:tc>
           <w:tcPr>
-            <w:tcW w:type="dxa" w:w="4320"/>
-          </w:tcPr>
-          <w:p>
-            <w:r>
-              <w:t>`idNumber`, `registrationNumber`, `ids`</w:t>
-            </w:r>
-          </w:p>
-        </w:tc>
-        <w:tc>
-          <w:tcPr>
-            <w:tcW w:type="dxa" w:w="4320"/>
-          </w:tcPr>
-          <w:p>
-            <w:r>
-              <w:t>`ids[]`</w:t>
+            <w:tcW w:type="dxa" w:w="2160"/>
+          </w:tcPr>
+          <w:p>
+            <w:r>
+              <w:t>ID rows (`idType`, `idNumber`, `idCountry`)</w:t>
+            </w:r>
+          </w:p>
+        </w:tc>
+        <w:tc>
+          <w:tcPr>
+            <w:tcW w:type="dxa" w:w="2160"/>
+          </w:tcPr>
+          <w:p>
+            <w:r>
+              <w:t>`ids[]` plus helper `idNumber[]` or `registrationNumber[]`</w:t>
+            </w:r>
+          </w:p>
+        </w:tc>
+        <w:tc>
+          <w:tcPr>
+            <w:tcW w:type="dxa" w:w="2160"/>
+          </w:tcPr>
+          <w:p>
+            <w:r>
+              <w:t>`ids[].idType`, `ids[].idValue`, `ids[].idCountry`</w:t>
+            </w:r>
+          </w:p>
+        </w:tc>
+        <w:tc>
+          <w:tcPr>
+            <w:tcW w:type="dxa" w:w="2160"/>
+          </w:tcPr>
+          <w:p>
+            <w:r>
+              <w:t>`ids[]` is primary; helper `idNumber`/`registrationNumber` is fallback only if `ids[]` is missing.</w:t>
             </w:r>
           </w:p>
         </w:tc>
@@ -5812,21 +6028,41 @@
       <w:tr>
         <w:tc>
           <w:tcPr>
-            <w:tcW w:type="dxa" w:w="4320"/>
-          </w:tcPr>
-          <w:p>
-            <w:r>
-              <w:t>`birthDate`</w:t>
-            </w:r>
-          </w:p>
-        </w:tc>
-        <w:tc>
-          <w:tcPr>
-            <w:tcW w:type="dxa" w:w="4320"/>
+            <w:tcW w:type="dxa" w:w="2160"/>
+          </w:tcPr>
+          <w:p>
+            <w:r>
+              <w:t>Date of Birth</w:t>
+            </w:r>
+          </w:p>
+        </w:tc>
+        <w:tc>
+          <w:tcPr>
+            <w:tcW w:type="dxa" w:w="2160"/>
+          </w:tcPr>
+          <w:p>
+            <w:r>
+              <w:t>`birthDate[]`</w:t>
+            </w:r>
+          </w:p>
+        </w:tc>
+        <w:tc>
+          <w:tcPr>
+            <w:tcW w:type="dxa" w:w="2160"/>
           </w:tcPr>
           <w:p>
             <w:r>
               <w:t>`dateOfBirth` or `yearOfBirth`</w:t>
+            </w:r>
+          </w:p>
+        </w:tc>
+        <w:tc>
+          <w:tcPr>
+            <w:tcW w:type="dxa" w:w="2160"/>
+          </w:tcPr>
+          <w:p>
+            <w:r>
+              <w:t>Normalized to Prudential format; year-only fallback is supported.</w:t>
             </w:r>
           </w:p>
         </w:tc>
@@ -5834,21 +6070,41 @@
       <w:tr>
         <w:tc>
           <w:tcPr>
-            <w:tcW w:type="dxa" w:w="4320"/>
-          </w:tcPr>
-          <w:p>
-            <w:r>
-              <w:t>`birthLocation`</w:t>
-            </w:r>
-          </w:p>
-        </w:tc>
-        <w:tc>
-          <w:tcPr>
-            <w:tcW w:type="dxa" w:w="4320"/>
+            <w:tcW w:type="dxa" w:w="2160"/>
+          </w:tcPr>
+          <w:p>
+            <w:r>
+              <w:t>Birth Location/Country of Birth</w:t>
+            </w:r>
+          </w:p>
+        </w:tc>
+        <w:tc>
+          <w:tcPr>
+            <w:tcW w:type="dxa" w:w="2160"/>
+          </w:tcPr>
+          <w:p>
+            <w:r>
+              <w:t>`birthLocation[]` or `countryOfBirth[]`</w:t>
+            </w:r>
+          </w:p>
+        </w:tc>
+        <w:tc>
+          <w:tcPr>
+            <w:tcW w:type="dxa" w:w="2160"/>
           </w:tcPr>
           <w:p>
             <w:r>
               <w:t>`countryofBirth`</w:t>
+            </w:r>
+          </w:p>
+        </w:tc>
+        <w:tc>
+          <w:tcPr>
+            <w:tcW w:type="dxa" w:w="2160"/>
+          </w:tcPr>
+          <w:p>
+            <w:r>
+              <w:t>First non-empty value is used.</w:t>
             </w:r>
           </w:p>
         </w:tc>
@@ -5856,7 +6112,27 @@
       <w:tr>
         <w:tc>
           <w:tcPr>
-            <w:tcW w:type="dxa" w:w="4320"/>
+            <w:tcW w:type="dxa" w:w="2160"/>
+          </w:tcPr>
+          <w:p>
+            <w:r>
+              <w:t>Gender</w:t>
+            </w:r>
+          </w:p>
+        </w:tc>
+        <w:tc>
+          <w:tcPr>
+            <w:tcW w:type="dxa" w:w="2160"/>
+          </w:tcPr>
+          <w:p>
+            <w:r>
+              <w:t>`gender[]`</w:t>
+            </w:r>
+          </w:p>
+        </w:tc>
+        <w:tc>
+          <w:tcPr>
+            <w:tcW w:type="dxa" w:w="2160"/>
           </w:tcPr>
           <w:p>
             <w:r>
@@ -5866,11 +6142,11 @@
         </w:tc>
         <w:tc>
           <w:tcPr>
-            <w:tcW w:type="dxa" w:w="4320"/>
-          </w:tcPr>
-          <w:p>
-            <w:r>
-              <w:t>Uppercase `gender`</w:t>
+            <w:tcW w:type="dxa" w:w="2160"/>
+          </w:tcPr>
+          <w:p>
+            <w:r>
+              <w:t>Normalized and sent uppercase.</w:t>
             </w:r>
           </w:p>
         </w:tc>
@@ -5878,21 +6154,41 @@
       <w:tr>
         <w:tc>
           <w:tcPr>
-            <w:tcW w:type="dxa" w:w="4320"/>
-          </w:tcPr>
-          <w:p>
-            <w:r>
-              <w:t>selected screening type</w:t>
-            </w:r>
-          </w:p>
-        </w:tc>
-        <w:tc>
-          <w:tcPr>
-            <w:tcW w:type="dxa" w:w="4320"/>
-          </w:tcPr>
-          <w:p>
-            <w:r>
-              <w:t>Resolved `screeningType`</w:t>
+            <w:tcW w:type="dxa" w:w="2160"/>
+          </w:tcPr>
+          <w:p>
+            <w:r>
+              <w:t>Title</w:t>
+            </w:r>
+          </w:p>
+        </w:tc>
+        <w:tc>
+          <w:tcPr>
+            <w:tcW w:type="dxa" w:w="2160"/>
+          </w:tcPr>
+          <w:p>
+            <w:r>
+              <w:t>`title[]`</w:t>
+            </w:r>
+          </w:p>
+        </w:tc>
+        <w:tc>
+          <w:tcPr>
+            <w:tcW w:type="dxa" w:w="2160"/>
+          </w:tcPr>
+          <w:p>
+            <w:r>
+              <w:t>`title`</w:t>
+            </w:r>
+          </w:p>
+        </w:tc>
+        <w:tc>
+          <w:tcPr>
+            <w:tcW w:type="dxa" w:w="2160"/>
+          </w:tcPr>
+          <w:p>
+            <w:r>
+              <w:t>Direct map.</w:t>
             </w:r>
           </w:p>
         </w:tc>
@@ -5900,21 +6196,1175 @@
       <w:tr>
         <w:tc>
           <w:tcPr>
-            <w:tcW w:type="dxa" w:w="4320"/>
-          </w:tcPr>
-          <w:p>
-            <w:r>
-              <w:t>selected business unit</w:t>
-            </w:r>
-          </w:p>
-        </w:tc>
-        <w:tc>
-          <w:tcPr>
-            <w:tcW w:type="dxa" w:w="4320"/>
-          </w:tcPr>
-          <w:p>
-            <w:r>
-              <w:t>`businessUnit`</w:t>
+            <w:tcW w:type="dxa" w:w="2160"/>
+          </w:tcPr>
+          <w:p>
+            <w:r>
+              <w:t>Notes</w:t>
+            </w:r>
+          </w:p>
+        </w:tc>
+        <w:tc>
+          <w:tcPr>
+            <w:tcW w:type="dxa" w:w="2160"/>
+          </w:tcPr>
+          <w:p>
+            <w:r>
+              <w:t>`screeningNotes[]`</w:t>
+            </w:r>
+          </w:p>
+        </w:tc>
+        <w:tc>
+          <w:tcPr>
+            <w:tcW w:type="dxa" w:w="2160"/>
+          </w:tcPr>
+          <w:p>
+            <w:r>
+              <w:t>`screeningNotes`</w:t>
+            </w:r>
+          </w:p>
+        </w:tc>
+        <w:tc>
+          <w:tcPr>
+            <w:tcW w:type="dxa" w:w="2160"/>
+          </w:tcPr>
+          <w:p>
+            <w:r>
+              <w:t>Direct map.</w:t>
+            </w:r>
+          </w:p>
+        </w:tc>
+      </w:tr>
+      <w:tr>
+        <w:tc>
+          <w:tcPr>
+            <w:tcW w:type="dxa" w:w="2160"/>
+          </w:tcPr>
+          <w:p>
+            <w:r>
+              <w:t>Mock toggle</w:t>
+            </w:r>
+          </w:p>
+        </w:tc>
+        <w:tc>
+          <w:tcPr>
+            <w:tcW w:type="dxa" w:w="2160"/>
+          </w:tcPr>
+          <w:p>
+            <w:r>
+              <w:t>Top-level `mock_screening`</w:t>
+            </w:r>
+          </w:p>
+        </w:tc>
+        <w:tc>
+          <w:tcPr>
+            <w:tcW w:type="dxa" w:w="2160"/>
+          </w:tcPr>
+          <w:p>
+            <w:r>
+              <w:t>`mock`</w:t>
+            </w:r>
+          </w:p>
+        </w:tc>
+        <w:tc>
+          <w:tcPr>
+            <w:tcW w:type="dxa" w:w="2160"/>
+          </w:tcPr>
+          <w:p>
+            <w:r>
+              <w:t>Boolean passthrough.</w:t>
+            </w:r>
+          </w:p>
+        </w:tc>
+      </w:tr>
+      <w:tr>
+        <w:tc>
+          <w:tcPr>
+            <w:tcW w:type="dxa" w:w="2160"/>
+          </w:tcPr>
+          <w:p>
+            <w:r>
+              <w:t>Party Key</w:t>
+            </w:r>
+          </w:p>
+        </w:tc>
+        <w:tc>
+          <w:tcPr>
+            <w:tcW w:type="dxa" w:w="2160"/>
+          </w:tcPr>
+          <w:p>
+            <w:r>
+              <w:t>`properties.partyKey` and `properties.partyKeysByScreeningType`</w:t>
+            </w:r>
+          </w:p>
+        </w:tc>
+        <w:tc>
+          <w:tcPr>
+            <w:tcW w:type="dxa" w:w="2160"/>
+          </w:tcPr>
+          <w:p>
+            <w:r>
+              <w:t>`partyKey`</w:t>
+            </w:r>
+          </w:p>
+        </w:tc>
+        <w:tc>
+          <w:tcPr>
+            <w:tcW w:type="dxa" w:w="2160"/>
+          </w:tcPr>
+          <w:p>
+            <w:r>
+              <w:t>Backend generates one key per selected type using `AMLP_OD_&lt;UNIQUE&gt;_&lt;SCREENING_TYPE_SUFFIX&gt;`.</w:t>
+            </w:r>
+          </w:p>
+        </w:tc>
+      </w:tr>
+    </w:tbl>
+    <w:p>
+      <w:pPr>
+        <w:pStyle w:val="Heading3"/>
+      </w:pPr>
+      <w:r>
+        <w:t>9.2 Batch Screening Field Mapping</w:t>
+      </w:r>
+    </w:p>
+    <w:p>
+      <w:pPr/>
+      <w:r>
+        <w:t>Batch flow has three mapping stages: upload metadata, file-row parsing, and per-screening-type enrichment.</w:t>
+      </w:r>
+    </w:p>
+    <w:p>
+      <w:pPr>
+        <w:pStyle w:val="Heading3"/>
+      </w:pPr>
+      <w:r>
+        <w:t>9.2.1 Batch Upload Form Metadata</w:t>
+      </w:r>
+    </w:p>
+    <w:tbl>
+      <w:tblPr>
+        <w:tblStyle w:val="TableGrid"/>
+        <w:tblW w:type="auto" w:w="0"/>
+        <w:tblLook w:firstColumn="1" w:firstRow="1" w:lastColumn="0" w:lastRow="0" w:noHBand="0" w:noVBand="1" w:val="04A0"/>
+      </w:tblPr>
+      <w:tblGrid>
+        <w:gridCol w:w="2880"/>
+        <w:gridCol w:w="2880"/>
+        <w:gridCol w:w="2880"/>
+      </w:tblGrid>
+      <w:tr>
+        <w:tc>
+          <w:tcPr>
+            <w:tcW w:type="dxa" w:w="2880"/>
+          </w:tcPr>
+          <w:p>
+            <w:r>
+              <w:rPr>
+                <w:b/>
+              </w:rPr>
+              <w:t>Upload Form Field</w:t>
+            </w:r>
+          </w:p>
+        </w:tc>
+        <w:tc>
+          <w:tcPr>
+            <w:tcW w:type="dxa" w:w="2880"/>
+          </w:tcPr>
+          <w:p>
+            <w:r>
+              <w:rPr>
+                <w:b/>
+              </w:rPr>
+              <w:t>Backend Field</w:t>
+            </w:r>
+          </w:p>
+        </w:tc>
+        <w:tc>
+          <w:tcPr>
+            <w:tcW w:type="dxa" w:w="2880"/>
+          </w:tcPr>
+          <w:p>
+            <w:r>
+              <w:rPr>
+                <w:b/>
+              </w:rPr>
+              <w:t>Usage</w:t>
+            </w:r>
+          </w:p>
+        </w:tc>
+      </w:tr>
+      <w:tr>
+        <w:tc>
+          <w:tcPr>
+            <w:tcW w:type="dxa" w:w="2880"/>
+          </w:tcPr>
+          <w:p>
+            <w:r>
+              <w:t>`file`</w:t>
+            </w:r>
+          </w:p>
+        </w:tc>
+        <w:tc>
+          <w:tcPr>
+            <w:tcW w:type="dxa" w:w="2880"/>
+          </w:tcPr>
+          <w:p>
+            <w:r>
+              <w:t>Source file bytes</w:t>
+            </w:r>
+          </w:p>
+        </w:tc>
+        <w:tc>
+          <w:tcPr>
+            <w:tcW w:type="dxa" w:w="2880"/>
+          </w:tcPr>
+          <w:p>
+            <w:r>
+              <w:t>Stored in S3 (`batch_file_uploads`) and parsed by worker/dispatcher.</w:t>
+            </w:r>
+          </w:p>
+        </w:tc>
+      </w:tr>
+      <w:tr>
+        <w:tc>
+          <w:tcPr>
+            <w:tcW w:type="dxa" w:w="2880"/>
+          </w:tcPr>
+          <w:p>
+            <w:r>
+              <w:t>`screening_types_json`</w:t>
+            </w:r>
+          </w:p>
+        </w:tc>
+        <w:tc>
+          <w:tcPr>
+            <w:tcW w:type="dxa" w:w="2880"/>
+          </w:tcPr>
+          <w:p>
+            <w:r>
+              <w:t>`screening_types[]`</w:t>
+            </w:r>
+          </w:p>
+        </w:tc>
+        <w:tc>
+          <w:tcPr>
+            <w:tcW w:type="dxa" w:w="2880"/>
+          </w:tcPr>
+          <w:p>
+            <w:r>
+              <w:t>Normalized against active DB mappings and business-unit allowlist.</w:t>
+            </w:r>
+          </w:p>
+        </w:tc>
+      </w:tr>
+      <w:tr>
+        <w:tc>
+          <w:tcPr>
+            <w:tcW w:type="dxa" w:w="2880"/>
+          </w:tcPr>
+          <w:p>
+            <w:r>
+              <w:t>`business_unit_code`</w:t>
+            </w:r>
+          </w:p>
+        </w:tc>
+        <w:tc>
+          <w:tcPr>
+            <w:tcW w:type="dxa" w:w="2880"/>
+          </w:tcPr>
+          <w:p>
+            <w:r>
+              <w:t>`business_unit_code`</w:t>
+            </w:r>
+          </w:p>
+        </w:tc>
+        <w:tc>
+          <w:tcPr>
+            <w:tcW w:type="dxa" w:w="2880"/>
+          </w:tcPr>
+          <w:p>
+            <w:r>
+              <w:t>Required; validated against current user BU mappings.</w:t>
+            </w:r>
+          </w:p>
+        </w:tc>
+      </w:tr>
+      <w:tr>
+        <w:tc>
+          <w:tcPr>
+            <w:tcW w:type="dxa" w:w="2880"/>
+          </w:tcPr>
+          <w:p>
+            <w:r>
+              <w:t>`batch_name`</w:t>
+            </w:r>
+          </w:p>
+        </w:tc>
+        <w:tc>
+          <w:tcPr>
+            <w:tcW w:type="dxa" w:w="2880"/>
+          </w:tcPr>
+          <w:p>
+            <w:r>
+              <w:t>`batch_name`</w:t>
+            </w:r>
+          </w:p>
+        </w:tc>
+        <w:tc>
+          <w:tcPr>
+            <w:tcW w:type="dxa" w:w="2880"/>
+          </w:tcPr>
+          <w:p>
+            <w:r>
+              <w:t>Job metadata and schedule display.</w:t>
+            </w:r>
+          </w:p>
+        </w:tc>
+      </w:tr>
+      <w:tr>
+        <w:tc>
+          <w:tcPr>
+            <w:tcW w:type="dxa" w:w="2880"/>
+          </w:tcPr>
+          <w:p>
+            <w:r>
+              <w:t>`daily_screening`, `schedule_frequency`, `schedule_run_at`, `schedule_id`</w:t>
+            </w:r>
+          </w:p>
+        </w:tc>
+        <w:tc>
+          <w:tcPr>
+            <w:tcW w:type="dxa" w:w="2880"/>
+          </w:tcPr>
+          <w:p>
+            <w:r>
+              <w:t>Schedule metadata</w:t>
+            </w:r>
+          </w:p>
+        </w:tc>
+        <w:tc>
+          <w:tcPr>
+            <w:tcW w:type="dxa" w:w="2880"/>
+          </w:tcPr>
+          <w:p>
+            <w:r>
+              <w:t>Controls immediate batch vs scheduled batch behavior.</w:t>
+            </w:r>
+          </w:p>
+        </w:tc>
+      </w:tr>
+      <w:tr>
+        <w:tc>
+          <w:tcPr>
+            <w:tcW w:type="dxa" w:w="2880"/>
+          </w:tcPr>
+          <w:p>
+            <w:r>
+              <w:t>`mock_screening`</w:t>
+            </w:r>
+          </w:p>
+        </w:tc>
+        <w:tc>
+          <w:tcPr>
+            <w:tcW w:type="dxa" w:w="2880"/>
+          </w:tcPr>
+          <w:p>
+            <w:r>
+              <w:t>`mock_screening`</w:t>
+            </w:r>
+          </w:p>
+        </w:tc>
+        <w:tc>
+          <w:tcPr>
+            <w:tcW w:type="dxa" w:w="2880"/>
+          </w:tcPr>
+          <w:p>
+            <w:r>
+              <w:t>Passed through to Actimize `mock`.</w:t>
+            </w:r>
+          </w:p>
+        </w:tc>
+      </w:tr>
+      <w:tr>
+        <w:tc>
+          <w:tcPr>
+            <w:tcW w:type="dxa" w:w="2880"/>
+          </w:tcPr>
+          <w:p>
+            <w:r>
+              <w:t>`user_name`</w:t>
+            </w:r>
+          </w:p>
+        </w:tc>
+        <w:tc>
+          <w:tcPr>
+            <w:tcW w:type="dxa" w:w="2880"/>
+          </w:tcPr>
+          <w:p>
+            <w:r>
+              <w:t>Audit display metadata</w:t>
+            </w:r>
+          </w:p>
+        </w:tc>
+        <w:tc>
+          <w:tcPr>
+            <w:tcW w:type="dxa" w:w="2880"/>
+          </w:tcPr>
+          <w:p>
+            <w:r>
+              <w:t>Stored for audit and operations visibility.</w:t>
+            </w:r>
+          </w:p>
+        </w:tc>
+      </w:tr>
+    </w:tbl>
+    <w:p>
+      <w:pPr>
+        <w:pStyle w:val="Heading3"/>
+      </w:pPr>
+      <w:r>
+        <w:t>9.2.2 File Column to Internal Query Mapping</w:t>
+      </w:r>
+    </w:p>
+    <w:tbl>
+      <w:tblPr>
+        <w:tblStyle w:val="TableGrid"/>
+        <w:tblW w:type="auto" w:w="0"/>
+        <w:tblLook w:firstColumn="1" w:firstRow="1" w:lastColumn="0" w:lastRow="0" w:noHBand="0" w:noVBand="1" w:val="04A0"/>
+      </w:tblPr>
+      <w:tblGrid>
+        <w:gridCol w:w="2880"/>
+        <w:gridCol w:w="2880"/>
+        <w:gridCol w:w="2880"/>
+      </w:tblGrid>
+      <w:tr>
+        <w:tc>
+          <w:tcPr>
+            <w:tcW w:type="dxa" w:w="2880"/>
+          </w:tcPr>
+          <w:p>
+            <w:r>
+              <w:rPr>
+                <w:b/>
+              </w:rPr>
+              <w:t>CSV/XLSX Column(s)</w:t>
+            </w:r>
+          </w:p>
+        </w:tc>
+        <w:tc>
+          <w:tcPr>
+            <w:tcW w:type="dxa" w:w="2880"/>
+          </w:tcPr>
+          <w:p>
+            <w:r>
+              <w:rPr>
+                <w:b/>
+              </w:rPr>
+              <w:t>Internal Query Field (`EntityExample.properties`)</w:t>
+            </w:r>
+          </w:p>
+        </w:tc>
+        <w:tc>
+          <w:tcPr>
+            <w:tcW w:type="dxa" w:w="2880"/>
+          </w:tcPr>
+          <w:p>
+            <w:r>
+              <w:rPr>
+                <w:b/>
+              </w:rPr>
+              <w:t>Notes</w:t>
+            </w:r>
+          </w:p>
+        </w:tc>
+      </w:tr>
+      <w:tr>
+        <w:tc>
+          <w:tcPr>
+            <w:tcW w:type="dxa" w:w="2880"/>
+          </w:tcPr>
+          <w:p>
+            <w:r>
+              <w:t>`PartyKey`</w:t>
+            </w:r>
+          </w:p>
+        </w:tc>
+        <w:tc>
+          <w:tcPr>
+            <w:tcW w:type="dxa" w:w="2880"/>
+          </w:tcPr>
+          <w:p>
+            <w:r>
+              <w:t>Base record key (query key)</w:t>
+            </w:r>
+          </w:p>
+        </w:tc>
+        <w:tc>
+          <w:tcPr>
+            <w:tcW w:type="dxa" w:w="2880"/>
+          </w:tcPr>
+          <w:p>
+            <w:r>
+              <w:t>Required and unique within file; becomes base for per-type item/party keys.</w:t>
+            </w:r>
+          </w:p>
+        </w:tc>
+      </w:tr>
+      <w:tr>
+        <w:tc>
+          <w:tcPr>
+            <w:tcW w:type="dxa" w:w="2880"/>
+          </w:tcPr>
+          <w:p>
+            <w:r>
+              <w:t>`PartyType` / `CustomerType`</w:t>
+            </w:r>
+          </w:p>
+        </w:tc>
+        <w:tc>
+          <w:tcPr>
+            <w:tcW w:type="dxa" w:w="2880"/>
+          </w:tcPr>
+          <w:p>
+            <w:r>
+              <w:t>`schema` (`Person` or `Company`/other)</w:t>
+            </w:r>
+          </w:p>
+        </w:tc>
+        <w:tc>
+          <w:tcPr>
+            <w:tcW w:type="dxa" w:w="2880"/>
+          </w:tcPr>
+          <w:p>
+            <w:r>
+              <w:t>Determines individual vs non-individual mapping behavior.</w:t>
+            </w:r>
+          </w:p>
+        </w:tc>
+      </w:tr>
+      <w:tr>
+        <w:tc>
+          <w:tcPr>
+            <w:tcW w:type="dxa" w:w="2880"/>
+          </w:tcPr>
+          <w:p>
+            <w:r>
+              <w:t>`PrimaryFirstName`, `PrimaryMiddleName`, `PrimaryLastName`, `PrimaryFullName`, `PrimaryMaidenName`</w:t>
+            </w:r>
+          </w:p>
+        </w:tc>
+        <w:tc>
+          <w:tcPr>
+            <w:tcW w:type="dxa" w:w="2880"/>
+          </w:tcPr>
+          <w:p>
+            <w:r>
+              <w:t>`name[]`, `firstName[]`, `middleName[]`, `lastName[]`, `fullName[]`, `maidenName[]`</w:t>
+            </w:r>
+          </w:p>
+        </w:tc>
+        <w:tc>
+          <w:tcPr>
+            <w:tcW w:type="dxa" w:w="2880"/>
+          </w:tcPr>
+          <w:p>
+            <w:r>
+              <w:t>Split and full names are both preserved for persons.</w:t>
+            </w:r>
+          </w:p>
+        </w:tc>
+      </w:tr>
+      <w:tr>
+        <w:tc>
+          <w:tcPr>
+            <w:tcW w:type="dxa" w:w="2880"/>
+          </w:tcPr>
+          <w:p>
+            <w:r>
+              <w:t>`AliasName`, `Alias1*`, `Alias2*`, `Alias3*`</w:t>
+            </w:r>
+          </w:p>
+        </w:tc>
+        <w:tc>
+          <w:tcPr>
+            <w:tcW w:type="dxa" w:w="2880"/>
+          </w:tcPr>
+          <w:p>
+            <w:r>
+              <w:t>`alias[]`, `aliases[]`</w:t>
+            </w:r>
+          </w:p>
+        </w:tc>
+        <w:tc>
+          <w:tcPr>
+            <w:tcW w:type="dxa" w:w="2880"/>
+          </w:tcPr>
+          <w:p>
+            <w:r>
+              <w:t>Structured aliases are built as objects.</w:t>
+            </w:r>
+          </w:p>
+        </w:tc>
+      </w:tr>
+      <w:tr>
+        <w:tc>
+          <w:tcPr>
+            <w:tcW w:type="dxa" w:w="2880"/>
+          </w:tcPr>
+          <w:p>
+            <w:r>
+              <w:t>`DateOfBirth` / `YearOfBirth`</w:t>
+            </w:r>
+          </w:p>
+        </w:tc>
+        <w:tc>
+          <w:tcPr>
+            <w:tcW w:type="dxa" w:w="2880"/>
+          </w:tcPr>
+          <w:p>
+            <w:r>
+              <w:t>`birthDate[]`</w:t>
+            </w:r>
+          </w:p>
+        </w:tc>
+        <w:tc>
+          <w:tcPr>
+            <w:tcW w:type="dxa" w:w="2880"/>
+          </w:tcPr>
+          <w:p>
+            <w:r>
+              <w:t>Date/year input preserved for downstream normalization.</w:t>
+            </w:r>
+          </w:p>
+        </w:tc>
+      </w:tr>
+      <w:tr>
+        <w:tc>
+          <w:tcPr>
+            <w:tcW w:type="dxa" w:w="2880"/>
+          </w:tcPr>
+          <w:p>
+            <w:r>
+              <w:t>`BirthLocation` / `BirthCountry`</w:t>
+            </w:r>
+          </w:p>
+        </w:tc>
+        <w:tc>
+          <w:tcPr>
+            <w:tcW w:type="dxa" w:w="2880"/>
+          </w:tcPr>
+          <w:p>
+            <w:r>
+              <w:t>`birthLocation[]`</w:t>
+            </w:r>
+          </w:p>
+        </w:tc>
+        <w:tc>
+          <w:tcPr>
+            <w:tcW w:type="dxa" w:w="2880"/>
+          </w:tcPr>
+          <w:p>
+            <w:r>
+              <w:t>First non-empty source is used.</w:t>
+            </w:r>
+          </w:p>
+        </w:tc>
+      </w:tr>
+      <w:tr>
+        <w:tc>
+          <w:tcPr>
+            <w:tcW w:type="dxa" w:w="2880"/>
+          </w:tcPr>
+          <w:p>
+            <w:r>
+              <w:t>`NationalityCountry1..3`, `Countries`, `Country`, address countries</w:t>
+            </w:r>
+          </w:p>
+        </w:tc>
+        <w:tc>
+          <w:tcPr>
+            <w:tcW w:type="dxa" w:w="2880"/>
+          </w:tcPr>
+          <w:p>
+            <w:r>
+              <w:t>`nationality[]` (person) or `country[]` (non-person)</w:t>
+            </w:r>
+          </w:p>
+        </w:tc>
+        <w:tc>
+          <w:tcPr>
+            <w:tcW w:type="dxa" w:w="2880"/>
+          </w:tcPr>
+          <w:p>
+            <w:r>
+              <w:t>Parser normalizes and deduplicates country list from multiple template columns.</w:t>
+            </w:r>
+          </w:p>
+        </w:tc>
+      </w:tr>
+      <w:tr>
+        <w:tc>
+          <w:tcPr>
+            <w:tcW w:type="dxa" w:w="2880"/>
+          </w:tcPr>
+          <w:p>
+            <w:r>
+              <w:t>`Address1*`, `Address2*`, `Address3*`, `Addresses`</w:t>
+            </w:r>
+          </w:p>
+        </w:tc>
+        <w:tc>
+          <w:tcPr>
+            <w:tcW w:type="dxa" w:w="2880"/>
+          </w:tcPr>
+          <w:p>
+            <w:r>
+              <w:t>`address[]`</w:t>
+            </w:r>
+          </w:p>
+        </w:tc>
+        <w:tc>
+          <w:tcPr>
+            <w:tcW w:type="dxa" w:w="2880"/>
+          </w:tcPr>
+          <w:p>
+            <w:r>
+              <w:t>Address components are composed into comma-separated lines.</w:t>
+            </w:r>
+          </w:p>
+        </w:tc>
+      </w:tr>
+      <w:tr>
+        <w:tc>
+          <w:tcPr>
+            <w:tcW w:type="dxa" w:w="2880"/>
+          </w:tcPr>
+          <w:p>
+            <w:r>
+              <w:t>`PartyId1*`, `PartyId2*`, `PartyId3*`</w:t>
+            </w:r>
+          </w:p>
+        </w:tc>
+        <w:tc>
+          <w:tcPr>
+            <w:tcW w:type="dxa" w:w="2880"/>
+          </w:tcPr>
+          <w:p>
+            <w:r>
+              <w:t>`ids[]` and helper `idNumber[]`/`registrationNumber[]`</w:t>
+            </w:r>
+          </w:p>
+        </w:tc>
+        <w:tc>
+          <w:tcPr>
+            <w:tcW w:type="dxa" w:w="2880"/>
+          </w:tcPr>
+          <w:p>
+            <w:r>
+              <w:t>`ids[]` stores `idType`, `idValue`, `idCountry`.</w:t>
+            </w:r>
+          </w:p>
+        </w:tc>
+      </w:tr>
+      <w:tr>
+        <w:tc>
+          <w:tcPr>
+            <w:tcW w:type="dxa" w:w="2880"/>
+          </w:tcPr>
+          <w:p>
+            <w:r>
+              <w:t>`Gender`</w:t>
+            </w:r>
+          </w:p>
+        </w:tc>
+        <w:tc>
+          <w:tcPr>
+            <w:tcW w:type="dxa" w:w="2880"/>
+          </w:tcPr>
+          <w:p>
+            <w:r>
+              <w:t>`gender[]`</w:t>
+            </w:r>
+          </w:p>
+        </w:tc>
+        <w:tc>
+          <w:tcPr>
+            <w:tcW w:type="dxa" w:w="2880"/>
+          </w:tcPr>
+          <w:p>
+            <w:r>
+              <w:t>Valid values enforced by parser (`Male`, `Female`, `Other`, or blank).</w:t>
+            </w:r>
+          </w:p>
+        </w:tc>
+      </w:tr>
+      <w:tr>
+        <w:tc>
+          <w:tcPr>
+            <w:tcW w:type="dxa" w:w="2880"/>
+          </w:tcPr>
+          <w:p>
+            <w:r>
+              <w:t>`Title`</w:t>
+            </w:r>
+          </w:p>
+        </w:tc>
+        <w:tc>
+          <w:tcPr>
+            <w:tcW w:type="dxa" w:w="2880"/>
+          </w:tcPr>
+          <w:p>
+            <w:r>
+              <w:t>`title[]`</w:t>
+            </w:r>
+          </w:p>
+        </w:tc>
+        <w:tc>
+          <w:tcPr>
+            <w:tcW w:type="dxa" w:w="2880"/>
+          </w:tcPr>
+          <w:p>
+            <w:r>
+              <w:t>Direct map.</w:t>
+            </w:r>
+          </w:p>
+        </w:tc>
+      </w:tr>
+      <w:tr>
+        <w:tc>
+          <w:tcPr>
+            <w:tcW w:type="dxa" w:w="2880"/>
+          </w:tcPr>
+          <w:p>
+            <w:r>
+              <w:t>`Notes` / `ScreeningNotes`</w:t>
+            </w:r>
+          </w:p>
+        </w:tc>
+        <w:tc>
+          <w:tcPr>
+            <w:tcW w:type="dxa" w:w="2880"/>
+          </w:tcPr>
+          <w:p>
+            <w:r>
+              <w:t>`notes[]`</w:t>
+            </w:r>
+          </w:p>
+        </w:tc>
+        <w:tc>
+          <w:tcPr>
+            <w:tcW w:type="dxa" w:w="2880"/>
+          </w:tcPr>
+          <w:p>
+            <w:r>
+              <w:t>Later mapped to Actimize `screeningNotes`.</w:t>
+            </w:r>
+          </w:p>
+        </w:tc>
+      </w:tr>
+    </w:tbl>
+    <w:p>
+      <w:pPr>
+        <w:pStyle w:val="Heading3"/>
+      </w:pPr>
+      <w:r>
+        <w:t>9.2.3 Worker Per-Screening-Type Enrichment</w:t>
+      </w:r>
+    </w:p>
+    <w:p>
+      <w:pPr/>
+      <w:r>
+        <w:t>For each parsed row and each selected screening type, worker creates a distinct item:</w:t>
+      </w:r>
+    </w:p>
+    <w:p>
+      <w:pPr>
+        <w:pStyle w:val="ListBullet"/>
+      </w:pPr>
+      <w:r>
+        <w:rPr>
+          <w:rFonts w:ascii="Consolas" w:hAnsi="Consolas"/>
+          <w:sz w:val="18"/>
+        </w:rPr>
+        <w:t>item_key = &lt;PartyKey&gt;_&lt;Screening_Type&gt;</w:t>
+      </w:r>
+    </w:p>
+    <w:p>
+      <w:pPr>
+        <w:pStyle w:val="ListBullet"/>
+      </w:pPr>
+      <w:r>
+        <w:rPr>
+          <w:rFonts w:ascii="Consolas" w:hAnsi="Consolas"/>
+          <w:sz w:val="18"/>
+        </w:rPr>
+        <w:t>partyKey = build_batch_party_key(&lt;PartyKey&gt;, &lt;Screening_Type&gt;)</w:t>
+      </w:r>
+    </w:p>
+    <w:p>
+      <w:pPr>
+        <w:pStyle w:val="ListBullet"/>
+      </w:pPr>
+      <w:r>
+        <w:rPr>
+          <w:rFonts w:ascii="Consolas" w:hAnsi="Consolas"/>
+          <w:sz w:val="18"/>
+        </w:rPr>
+        <w:t>partyKeysByScreeningType = { &lt;Screening_Type&gt;: &lt;partyKey&gt; }</w:t>
+      </w:r>
+    </w:p>
+    <w:p>
+      <w:pPr>
+        <w:pStyle w:val="ListBullet"/>
+      </w:pPr>
+      <w:r>
+        <w:rPr>
+          <w:rFonts w:ascii="Consolas" w:hAnsi="Consolas"/>
+          <w:sz w:val="18"/>
+        </w:rPr>
+        <w:t>screeningType = &lt;Screening_Type&gt;</w:t>
+      </w:r>
+    </w:p>
+    <w:p>
+      <w:pPr>
+        <w:pStyle w:val="ListBullet"/>
+      </w:pPr>
+      <w:r>
+        <w:rPr>
+          <w:rFonts w:ascii="Consolas" w:hAnsi="Consolas"/>
+          <w:sz w:val="18"/>
+        </w:rPr>
+        <w:t>businessUnit = &lt;business_unit_code&gt;</w:t>
+      </w:r>
+    </w:p>
+    <w:p>
+      <w:pPr/>
+      <w:r>
+        <w:rPr>
+          <w:rFonts w:ascii="Consolas" w:hAnsi="Consolas"/>
+          <w:sz w:val="18"/>
+        </w:rPr>
+        <w:t>screeningType</w:t>
+      </w:r>
+      <w:r>
+        <w:t xml:space="preserve"> is resolved by DB mapping when constructing Actimize payload:</w:t>
+      </w:r>
+    </w:p>
+    <w:p>
+      <w:pPr>
+        <w:pStyle w:val="ListBullet"/>
+      </w:pPr>
+      <w:r>
+        <w:t xml:space="preserve">Source screening type key: </w:t>
+      </w:r>
+      <w:r>
+        <w:rPr>
+          <w:rFonts w:ascii="Consolas" w:hAnsi="Consolas"/>
+          <w:sz w:val="18"/>
+        </w:rPr>
+        <w:t>actimize_screening_type_mappings.Screening_Type</w:t>
+      </w:r>
+    </w:p>
+    <w:p>
+      <w:pPr>
+        <w:pStyle w:val="ListBullet"/>
+      </w:pPr>
+      <w:r>
+        <w:t xml:space="preserve">Actimize outbound value: </w:t>
+      </w:r>
+      <w:r>
+        <w:rPr>
+          <w:rFonts w:ascii="Consolas" w:hAnsi="Consolas"/>
+          <w:sz w:val="18"/>
+        </w:rPr>
+        <w:t>actimize_screening_type_mappings.Search_Definition_ID</w:t>
+      </w:r>
+    </w:p>
+    <w:p>
+      <w:pPr>
+        <w:pStyle w:val="Heading3"/>
+      </w:pPr>
+      <w:r>
+        <w:t>9.2.4 Internal Helper Fields vs Outbound Fields</w:t>
+      </w:r>
+    </w:p>
+    <w:tbl>
+      <w:tblPr>
+        <w:tblStyle w:val="TableGrid"/>
+        <w:tblW w:type="auto" w:w="0"/>
+        <w:tblLook w:firstColumn="1" w:firstRow="1" w:lastColumn="0" w:lastRow="0" w:noHBand="0" w:noVBand="1" w:val="04A0"/>
+      </w:tblPr>
+      <w:tblGrid>
+        <w:gridCol w:w="2880"/>
+        <w:gridCol w:w="2880"/>
+        <w:gridCol w:w="2880"/>
+      </w:tblGrid>
+      <w:tr>
+        <w:tc>
+          <w:tcPr>
+            <w:tcW w:type="dxa" w:w="2880"/>
+          </w:tcPr>
+          <w:p>
+            <w:r>
+              <w:rPr>
+                <w:b/>
+              </w:rPr>
+              <w:t>Internal Field</w:t>
+            </w:r>
+          </w:p>
+        </w:tc>
+        <w:tc>
+          <w:tcPr>
+            <w:tcW w:type="dxa" w:w="2880"/>
+          </w:tcPr>
+          <w:p>
+            <w:r>
+              <w:rPr>
+                <w:b/>
+              </w:rPr>
+              <w:t>Sent to Actimize</w:t>
+            </w:r>
+          </w:p>
+        </w:tc>
+        <w:tc>
+          <w:tcPr>
+            <w:tcW w:type="dxa" w:w="2880"/>
+          </w:tcPr>
+          <w:p>
+            <w:r>
+              <w:rPr>
+                <w:b/>
+              </w:rPr>
+              <w:t>Purpose</w:t>
+            </w:r>
+          </w:p>
+        </w:tc>
+      </w:tr>
+      <w:tr>
+        <w:tc>
+          <w:tcPr>
+            <w:tcW w:type="dxa" w:w="2880"/>
+          </w:tcPr>
+          <w:p>
+            <w:r>
+              <w:t>`idNumber[]` / `registrationNumber[]`</w:t>
+            </w:r>
+          </w:p>
+        </w:tc>
+        <w:tc>
+          <w:tcPr>
+            <w:tcW w:type="dxa" w:w="2880"/>
+          </w:tcPr>
+          <w:p>
+            <w:r>
+              <w:t>No (used as fallback only)</w:t>
+            </w:r>
+          </w:p>
+        </w:tc>
+        <w:tc>
+          <w:tcPr>
+            <w:tcW w:type="dxa" w:w="2880"/>
+          </w:tcPr>
+          <w:p>
+            <w:r>
+              <w:t>Backward-compatible ID helper if `ids[]` is missing.</w:t>
+            </w:r>
+          </w:p>
+        </w:tc>
+      </w:tr>
+      <w:tr>
+        <w:tc>
+          <w:tcPr>
+            <w:tcW w:type="dxa" w:w="2880"/>
+          </w:tcPr>
+          <w:p>
+            <w:r>
+              <w:t>`partyKeysByScreeningType`</w:t>
+            </w:r>
+          </w:p>
+        </w:tc>
+        <w:tc>
+          <w:tcPr>
+            <w:tcW w:type="dxa" w:w="2880"/>
+          </w:tcPr>
+          <w:p>
+            <w:r>
+              <w:t>No</w:t>
+            </w:r>
+          </w:p>
+        </w:tc>
+        <w:tc>
+          <w:tcPr>
+            <w:tcW w:type="dxa" w:w="2880"/>
+          </w:tcPr>
+          <w:p>
+            <w:r>
+              <w:t>Internal tracing across multi-type requests.</w:t>
+            </w:r>
+          </w:p>
+        </w:tc>
+      </w:tr>
+      <w:tr>
+        <w:tc>
+          <w:tcPr>
+            <w:tcW w:type="dxa" w:w="2880"/>
+          </w:tcPr>
+          <w:p>
+            <w:r>
+              <w:t>`notes[]`</w:t>
+            </w:r>
+          </w:p>
+        </w:tc>
+        <w:tc>
+          <w:tcPr>
+            <w:tcW w:type="dxa" w:w="2880"/>
+          </w:tcPr>
+          <w:p>
+            <w:r>
+              <w:t>No (mapped to `screeningNotes`)</w:t>
+            </w:r>
+          </w:p>
+        </w:tc>
+        <w:tc>
+          <w:tcPr>
+            <w:tcW w:type="dxa" w:w="2880"/>
+          </w:tcPr>
+          <w:p>
+            <w:r>
+              <w:t>Internal input alias for screening notes.</w:t>
+            </w:r>
+          </w:p>
+        </w:tc>
+      </w:tr>
+      <w:tr>
+        <w:tc>
+          <w:tcPr>
+            <w:tcW w:type="dxa" w:w="2880"/>
+          </w:tcPr>
+          <w:p>
+            <w:r>
+              <w:t>`name[]`</w:t>
+            </w:r>
+          </w:p>
+        </w:tc>
+        <w:tc>
+          <w:tcPr>
+            <w:tcW w:type="dxa" w:w="2880"/>
+          </w:tcPr>
+          <w:p>
+            <w:r>
+              <w:t>Indirect (`names`)</w:t>
+            </w:r>
+          </w:p>
+        </w:tc>
+        <w:tc>
+          <w:tcPr>
+            <w:tcW w:type="dxa" w:w="2880"/>
+          </w:tcPr>
+          <w:p>
+            <w:r>
+              <w:t>Internal canonical name list used to build Actimize `names` object and aliases.</w:t>
             </w:r>
           </w:p>
         </w:tc>

</xml_diff>